<commit_message>
added firebase database authentication adn create account oage
</commit_message>
<xml_diff>
--- a/Diary for project.docx
+++ b/Diary for project.docx
@@ -44,15 +44,7 @@
         </w:numPr>
       </w:pPr>
       <w:r>
-        <w:t xml:space="preserve">Made Lists of </w:t>
-      </w:r>
-      <w:proofErr w:type="gramStart"/>
-      <w:r>
-        <w:t>context</w:t>
-      </w:r>
-      <w:proofErr w:type="gramEnd"/>
-      <w:r>
-        <w:t xml:space="preserve"> and Started introduction </w:t>
+        <w:t xml:space="preserve">Made Lists of context and Started introduction </w:t>
       </w:r>
     </w:p>
     <w:p>
@@ -540,13 +532,8 @@
         </w:numPr>
       </w:pPr>
       <w:r>
-        <w:t xml:space="preserve">Create </w:t>
-      </w:r>
-      <w:proofErr w:type="spellStart"/>
-      <w:r>
-        <w:t>campgin</w:t>
-      </w:r>
-      <w:proofErr w:type="spellEnd"/>
+        <w:t>Create campgin</w:t>
+      </w:r>
     </w:p>
     <w:p>
       <w:pPr>
@@ -608,15 +595,7 @@
         </w:numPr>
       </w:pPr>
       <w:r>
-        <w:t xml:space="preserve">Created Models.py to </w:t>
-      </w:r>
-      <w:proofErr w:type="spellStart"/>
-      <w:r>
-        <w:t>comtrol</w:t>
-      </w:r>
-      <w:proofErr w:type="spellEnd"/>
-      <w:r>
-        <w:t xml:space="preserve"> results table and campaign tables</w:t>
+        <w:t>Created Models.py to comtrol results table and campaign tables</w:t>
       </w:r>
     </w:p>
     <w:p>
@@ -631,6 +610,241 @@
         <w:t xml:space="preserve">Connected database to app </w:t>
       </w:r>
     </w:p>
+    <w:p>
+      <w:pPr>
+        <w:pStyle w:val="ListParagraph"/>
+        <w:numPr>
+          <w:ilvl w:val="0"/>
+          <w:numId w:val="6"/>
+        </w:numPr>
+      </w:pPr>
+      <w:r>
+        <w:t xml:space="preserve">Implemented routes </w:t>
+      </w:r>
+    </w:p>
+    <w:p>
+      <w:pPr>
+        <w:pStyle w:val="ListParagraph"/>
+        <w:numPr>
+          <w:ilvl w:val="0"/>
+          <w:numId w:val="6"/>
+        </w:numPr>
+      </w:pPr>
+      <w:r>
+        <w:t xml:space="preserve">Made fake simulation and ran it </w:t>
+      </w:r>
+    </w:p>
+    <w:p>
+      <w:pPr>
+        <w:pStyle w:val="ListParagraph"/>
+        <w:numPr>
+          <w:ilvl w:val="0"/>
+          <w:numId w:val="6"/>
+        </w:numPr>
+      </w:pPr>
+      <w:r>
+        <w:t>Made navigation and made sure all pages are fully connected</w:t>
+      </w:r>
+    </w:p>
+    <w:p>
+      <w:pPr>
+        <w:rPr>
+          <w:b/>
+          <w:bCs/>
+        </w:rPr>
+      </w:pPr>
+      <w:r>
+        <w:rPr>
+          <w:b/>
+          <w:bCs/>
+        </w:rPr>
+        <w:t>12/2/26</w:t>
+      </w:r>
+    </w:p>
+    <w:p>
+      <w:pPr>
+        <w:pStyle w:val="ListParagraph"/>
+        <w:numPr>
+          <w:ilvl w:val="0"/>
+          <w:numId w:val="7"/>
+        </w:numPr>
+      </w:pPr>
+      <w:r>
+        <w:t>Added firebase database</w:t>
+      </w:r>
+    </w:p>
+    <w:p>
+      <w:pPr>
+        <w:rPr>
+          <w:b/>
+          <w:bCs/>
+        </w:rPr>
+      </w:pPr>
+      <w:r>
+        <w:rPr>
+          <w:b/>
+          <w:bCs/>
+        </w:rPr>
+        <w:t>20/2/26</w:t>
+      </w:r>
+    </w:p>
+    <w:p>
+      <w:pPr>
+        <w:pStyle w:val="ListParagraph"/>
+        <w:numPr>
+          <w:ilvl w:val="0"/>
+          <w:numId w:val="7"/>
+        </w:numPr>
+      </w:pPr>
+      <w:r>
+        <w:t xml:space="preserve">Added firebase Authentication </w:t>
+      </w:r>
+    </w:p>
+    <w:p>
+      <w:pPr>
+        <w:rPr>
+          <w:b/>
+          <w:bCs/>
+        </w:rPr>
+      </w:pPr>
+      <w:r>
+        <w:rPr>
+          <w:b/>
+          <w:bCs/>
+        </w:rPr>
+        <w:t>1/3/26</w:t>
+      </w:r>
+    </w:p>
+    <w:p>
+      <w:pPr>
+        <w:pStyle w:val="ListParagraph"/>
+        <w:numPr>
+          <w:ilvl w:val="0"/>
+          <w:numId w:val="7"/>
+        </w:numPr>
+        <w:rPr>
+          <w:b/>
+          <w:bCs/>
+        </w:rPr>
+      </w:pPr>
+      <w:r>
+        <w:t>Added create account page</w:t>
+      </w:r>
+    </w:p>
+    <w:p>
+      <w:pPr>
+        <w:pStyle w:val="ListParagraph"/>
+        <w:numPr>
+          <w:ilvl w:val="0"/>
+          <w:numId w:val="7"/>
+        </w:numPr>
+        <w:rPr>
+          <w:b/>
+          <w:bCs/>
+        </w:rPr>
+      </w:pPr>
+      <w:r>
+        <w:rPr>
+          <w:b/>
+          <w:bCs/>
+        </w:rPr>
+        <w:t>..</w:t>
+      </w:r>
+    </w:p>
+    <w:p>
+      <w:pPr>
+        <w:pStyle w:val="ListParagraph"/>
+        <w:numPr>
+          <w:ilvl w:val="0"/>
+          <w:numId w:val="7"/>
+        </w:numPr>
+        <w:rPr>
+          <w:b/>
+          <w:bCs/>
+        </w:rPr>
+      </w:pPr>
+      <w:r>
+        <w:rPr>
+          <w:b/>
+          <w:bCs/>
+        </w:rPr>
+        <w:t>..</w:t>
+      </w:r>
+    </w:p>
+    <w:p>
+      <w:pPr>
+        <w:rPr>
+          <w:b/>
+          <w:bCs/>
+        </w:rPr>
+      </w:pPr>
+      <w:r>
+        <w:rPr>
+          <w:b/>
+          <w:bCs/>
+        </w:rPr>
+        <w:t>10/3/2026</w:t>
+      </w:r>
+    </w:p>
+    <w:p>
+      <w:pPr>
+        <w:pStyle w:val="ListParagraph"/>
+        <w:numPr>
+          <w:ilvl w:val="0"/>
+          <w:numId w:val="8"/>
+        </w:numPr>
+      </w:pPr>
+      <w:r>
+        <w:t xml:space="preserve">Started </w:t>
+      </w:r>
+      <w:r>
+        <w:t>work on final report</w:t>
+      </w:r>
+    </w:p>
+    <w:p/>
+    <w:p>
+      <w:hyperlink r:id="rId5" w:history="1">
+        <w:r>
+          <w:rPr>
+            <w:rStyle w:val="Hyperlink"/>
+          </w:rPr>
+          <w:t>https://medium.com/full-stack-engineer/the-simplest-firebase-api-6521d4307cb7</w:t>
+        </w:r>
+      </w:hyperlink>
+    </w:p>
+    <w:p>
+      <w:hyperlink r:id="rId6" w:history="1">
+        <w:r>
+          <w:rPr>
+            <w:rStyle w:val="Hyperlink"/>
+          </w:rPr>
+          <w:t>https://flask.palletsprojects.com/en/stable/</w:t>
+        </w:r>
+      </w:hyperlink>
+    </w:p>
+    <w:p>
+      <w:hyperlink r:id="rId7" w:history="1">
+        <w:r>
+          <w:rPr>
+            <w:rStyle w:val="Hyperlink"/>
+          </w:rPr>
+          <w:t>https://www.w3schools.com/python/</w:t>
+        </w:r>
+      </w:hyperlink>
+    </w:p>
+    <w:p/>
+    <w:p>
+      <w:hyperlink r:id="rId8" w:history="1">
+        <w:r>
+          <w:rPr>
+            <w:rStyle w:val="Hyperlink"/>
+          </w:rPr>
+          <w:t>https://realpython.com/</w:t>
+        </w:r>
+      </w:hyperlink>
+    </w:p>
+    <w:p/>
+    <w:p/>
     <w:p>
       <w:pPr>
         <w:rPr>
@@ -671,7 +885,7 @@
                     <pic:cNvPicPr/>
                   </pic:nvPicPr>
                   <pic:blipFill>
-                    <a:blip r:embed="rId5"/>
+                    <a:blip r:embed="rId9"/>
                     <a:stretch>
                       <a:fillRect/>
                     </a:stretch>
@@ -722,7 +936,7 @@
                     <pic:cNvPicPr/>
                   </pic:nvPicPr>
                   <pic:blipFill>
-                    <a:blip r:embed="rId6"/>
+                    <a:blip r:embed="rId10"/>
                     <a:stretch>
                       <a:fillRect/>
                     </a:stretch>
@@ -772,7 +986,7 @@
                     <pic:cNvPicPr/>
                   </pic:nvPicPr>
                   <pic:blipFill>
-                    <a:blip r:embed="rId7"/>
+                    <a:blip r:embed="rId11"/>
                     <a:stretch>
                       <a:fillRect/>
                     </a:stretch>
@@ -823,7 +1037,7 @@
                     <pic:cNvPicPr/>
                   </pic:nvPicPr>
                   <pic:blipFill>
-                    <a:blip r:embed="rId8"/>
+                    <a:blip r:embed="rId12"/>
                     <a:stretch>
                       <a:fillRect/>
                     </a:stretch>
@@ -857,6 +1071,119 @@
 <file path=word/numbering.xml><?xml version="1.0" encoding="utf-8"?>
 <w:numbering xmlns:wpc="http://schemas.microsoft.com/office/word/2010/wordprocessingCanvas" xmlns:cx="http://schemas.microsoft.com/office/drawing/2014/chartex" xmlns:cx1="http://schemas.microsoft.com/office/drawing/2015/9/8/chartex" xmlns:cx2="http://schemas.microsoft.com/office/drawing/2015/10/21/chartex" xmlns:cx3="http://schemas.microsoft.com/office/drawing/2016/5/9/chartex" xmlns:cx4="http://schemas.microsoft.com/office/drawing/2016/5/10/chartex" xmlns:cx5="http://schemas.microsoft.com/office/drawing/2016/5/11/chartex" xmlns:cx6="http://schemas.microsoft.com/office/drawing/2016/5/12/chartex" xmlns:cx7="http://schemas.microsoft.com/office/drawing/2016/5/13/chartex" xmlns:cx8="http://schemas.microsoft.com/office/drawing/2016/5/14/chartex" xmlns:mc="http://schemas.openxmlformats.org/markup-compatibility/2006" xmlns:aink="http://schemas.microsoft.com/office/drawing/2016/ink" xmlns:am3d="http://schemas.microsoft.com/office/drawing/2017/model3d" xmlns:o="urn:schemas-microsoft-com:office:office" xmlns:oel="http://schemas.microsoft.com/office/2019/extlst" xmlns:r="http://schemas.openxmlformats.org/officeDocument/2006/relationships" xmlns:m="http://schemas.openxmlformats.org/officeDocument/2006/math" xmlns:v="urn:schemas-microsoft-com:vml" xmlns:wp14="http://schemas.microsoft.com/office/word/2010/wordprocessingDrawing" xmlns:wp="http://schemas.openxmlformats.org/drawingml/2006/wordprocessingDrawing" xmlns:w10="urn:schemas-microsoft-com:office:word" xmlns:w="http://schemas.openxmlformats.org/wordprocessingml/2006/main" xmlns:w14="http://schemas.microsoft.com/office/word/2010/wordml" xmlns:w15="http://schemas.microsoft.com/office/word/2012/wordml" xmlns:w16cex="http://schemas.microsoft.com/office/word/2018/wordml/cex" xmlns:w16cid="http://schemas.microsoft.com/office/word/2016/wordml/cid" xmlns:w16="http://schemas.microsoft.com/office/word/2018/wordml" xmlns:w16du="http://schemas.microsoft.com/office/word/2023/wordml/word16du" xmlns:w16sdtdh="http://schemas.microsoft.com/office/word/2020/wordml/sdtdatahash" xmlns:w16sdtfl="http://schemas.microsoft.com/office/word/2024/wordml/sdtformatlock" xmlns:w16se="http://schemas.microsoft.com/office/word/2015/wordml/symex" xmlns:wpg="http://schemas.microsoft.com/office/word/2010/wordprocessingGroup" xmlns:wpi="http://schemas.microsoft.com/office/word/2010/wordprocessingInk" xmlns:wne="http://schemas.microsoft.com/office/word/2006/wordml" xmlns:wps="http://schemas.microsoft.com/office/word/2010/wordprocessingShape" mc:Ignorable="w14 w15 w16se w16cid w16 w16cex w16sdtdh w16sdtfl w16du wp14">
   <w:abstractNum w:abstractNumId="0" w15:restartNumberingAfterBreak="0">
+    <w:nsid w:val="1A463877"/>
+    <w:multiLevelType w:val="hybridMultilevel"/>
+    <w:tmpl w:val="BFA80A26"/>
+    <w:lvl w:ilvl="0" w:tplc="18090001">
+      <w:start w:val="1"/>
+      <w:numFmt w:val="bullet"/>
+      <w:lvlText w:val=""/>
+      <w:lvlJc w:val="left"/>
+      <w:pPr>
+        <w:ind w:left="720" w:hanging="360"/>
+      </w:pPr>
+      <w:rPr>
+        <w:rFonts w:ascii="Symbol" w:hAnsi="Symbol" w:hint="default"/>
+      </w:rPr>
+    </w:lvl>
+    <w:lvl w:ilvl="1" w:tplc="18090003" w:tentative="1">
+      <w:start w:val="1"/>
+      <w:numFmt w:val="bullet"/>
+      <w:lvlText w:val="o"/>
+      <w:lvlJc w:val="left"/>
+      <w:pPr>
+        <w:ind w:left="1440" w:hanging="360"/>
+      </w:pPr>
+      <w:rPr>
+        <w:rFonts w:ascii="Courier New" w:hAnsi="Courier New" w:cs="Courier New" w:hint="default"/>
+      </w:rPr>
+    </w:lvl>
+    <w:lvl w:ilvl="2" w:tplc="18090005" w:tentative="1">
+      <w:start w:val="1"/>
+      <w:numFmt w:val="bullet"/>
+      <w:lvlText w:val=""/>
+      <w:lvlJc w:val="left"/>
+      <w:pPr>
+        <w:ind w:left="2160" w:hanging="360"/>
+      </w:pPr>
+      <w:rPr>
+        <w:rFonts w:ascii="Wingdings" w:hAnsi="Wingdings" w:hint="default"/>
+      </w:rPr>
+    </w:lvl>
+    <w:lvl w:ilvl="3" w:tplc="18090001" w:tentative="1">
+      <w:start w:val="1"/>
+      <w:numFmt w:val="bullet"/>
+      <w:lvlText w:val=""/>
+      <w:lvlJc w:val="left"/>
+      <w:pPr>
+        <w:ind w:left="2880" w:hanging="360"/>
+      </w:pPr>
+      <w:rPr>
+        <w:rFonts w:ascii="Symbol" w:hAnsi="Symbol" w:hint="default"/>
+      </w:rPr>
+    </w:lvl>
+    <w:lvl w:ilvl="4" w:tplc="18090003" w:tentative="1">
+      <w:start w:val="1"/>
+      <w:numFmt w:val="bullet"/>
+      <w:lvlText w:val="o"/>
+      <w:lvlJc w:val="left"/>
+      <w:pPr>
+        <w:ind w:left="3600" w:hanging="360"/>
+      </w:pPr>
+      <w:rPr>
+        <w:rFonts w:ascii="Courier New" w:hAnsi="Courier New" w:cs="Courier New" w:hint="default"/>
+      </w:rPr>
+    </w:lvl>
+    <w:lvl w:ilvl="5" w:tplc="18090005" w:tentative="1">
+      <w:start w:val="1"/>
+      <w:numFmt w:val="bullet"/>
+      <w:lvlText w:val=""/>
+      <w:lvlJc w:val="left"/>
+      <w:pPr>
+        <w:ind w:left="4320" w:hanging="360"/>
+      </w:pPr>
+      <w:rPr>
+        <w:rFonts w:ascii="Wingdings" w:hAnsi="Wingdings" w:hint="default"/>
+      </w:rPr>
+    </w:lvl>
+    <w:lvl w:ilvl="6" w:tplc="18090001" w:tentative="1">
+      <w:start w:val="1"/>
+      <w:numFmt w:val="bullet"/>
+      <w:lvlText w:val=""/>
+      <w:lvlJc w:val="left"/>
+      <w:pPr>
+        <w:ind w:left="5040" w:hanging="360"/>
+      </w:pPr>
+      <w:rPr>
+        <w:rFonts w:ascii="Symbol" w:hAnsi="Symbol" w:hint="default"/>
+      </w:rPr>
+    </w:lvl>
+    <w:lvl w:ilvl="7" w:tplc="18090003" w:tentative="1">
+      <w:start w:val="1"/>
+      <w:numFmt w:val="bullet"/>
+      <w:lvlText w:val="o"/>
+      <w:lvlJc w:val="left"/>
+      <w:pPr>
+        <w:ind w:left="5760" w:hanging="360"/>
+      </w:pPr>
+      <w:rPr>
+        <w:rFonts w:ascii="Courier New" w:hAnsi="Courier New" w:cs="Courier New" w:hint="default"/>
+      </w:rPr>
+    </w:lvl>
+    <w:lvl w:ilvl="8" w:tplc="18090005" w:tentative="1">
+      <w:start w:val="1"/>
+      <w:numFmt w:val="bullet"/>
+      <w:lvlText w:val=""/>
+      <w:lvlJc w:val="left"/>
+      <w:pPr>
+        <w:ind w:left="6480" w:hanging="360"/>
+      </w:pPr>
+      <w:rPr>
+        <w:rFonts w:ascii="Wingdings" w:hAnsi="Wingdings" w:hint="default"/>
+      </w:rPr>
+    </w:lvl>
+  </w:abstractNum>
+  <w:abstractNum w:abstractNumId="1" w15:restartNumberingAfterBreak="0">
     <w:nsid w:val="1F953D3F"/>
     <w:multiLevelType w:val="hybridMultilevel"/>
     <w:tmpl w:val="20442008"/>
@@ -969,7 +1296,7 @@
       </w:rPr>
     </w:lvl>
   </w:abstractNum>
-  <w:abstractNum w:abstractNumId="1" w15:restartNumberingAfterBreak="0">
+  <w:abstractNum w:abstractNumId="2" w15:restartNumberingAfterBreak="0">
     <w:nsid w:val="2C8658B3"/>
     <w:multiLevelType w:val="hybridMultilevel"/>
     <w:tmpl w:val="C8B08D0A"/>
@@ -1082,7 +1409,120 @@
       </w:rPr>
     </w:lvl>
   </w:abstractNum>
-  <w:abstractNum w:abstractNumId="2" w15:restartNumberingAfterBreak="0">
+  <w:abstractNum w:abstractNumId="3" w15:restartNumberingAfterBreak="0">
+    <w:nsid w:val="4A945192"/>
+    <w:multiLevelType w:val="hybridMultilevel"/>
+    <w:tmpl w:val="93581D76"/>
+    <w:lvl w:ilvl="0" w:tplc="18090001">
+      <w:start w:val="1"/>
+      <w:numFmt w:val="bullet"/>
+      <w:lvlText w:val=""/>
+      <w:lvlJc w:val="left"/>
+      <w:pPr>
+        <w:ind w:left="720" w:hanging="360"/>
+      </w:pPr>
+      <w:rPr>
+        <w:rFonts w:ascii="Symbol" w:hAnsi="Symbol" w:hint="default"/>
+      </w:rPr>
+    </w:lvl>
+    <w:lvl w:ilvl="1" w:tplc="18090003" w:tentative="1">
+      <w:start w:val="1"/>
+      <w:numFmt w:val="bullet"/>
+      <w:lvlText w:val="o"/>
+      <w:lvlJc w:val="left"/>
+      <w:pPr>
+        <w:ind w:left="1440" w:hanging="360"/>
+      </w:pPr>
+      <w:rPr>
+        <w:rFonts w:ascii="Courier New" w:hAnsi="Courier New" w:cs="Courier New" w:hint="default"/>
+      </w:rPr>
+    </w:lvl>
+    <w:lvl w:ilvl="2" w:tplc="18090005" w:tentative="1">
+      <w:start w:val="1"/>
+      <w:numFmt w:val="bullet"/>
+      <w:lvlText w:val=""/>
+      <w:lvlJc w:val="left"/>
+      <w:pPr>
+        <w:ind w:left="2160" w:hanging="360"/>
+      </w:pPr>
+      <w:rPr>
+        <w:rFonts w:ascii="Wingdings" w:hAnsi="Wingdings" w:hint="default"/>
+      </w:rPr>
+    </w:lvl>
+    <w:lvl w:ilvl="3" w:tplc="18090001" w:tentative="1">
+      <w:start w:val="1"/>
+      <w:numFmt w:val="bullet"/>
+      <w:lvlText w:val=""/>
+      <w:lvlJc w:val="left"/>
+      <w:pPr>
+        <w:ind w:left="2880" w:hanging="360"/>
+      </w:pPr>
+      <w:rPr>
+        <w:rFonts w:ascii="Symbol" w:hAnsi="Symbol" w:hint="default"/>
+      </w:rPr>
+    </w:lvl>
+    <w:lvl w:ilvl="4" w:tplc="18090003" w:tentative="1">
+      <w:start w:val="1"/>
+      <w:numFmt w:val="bullet"/>
+      <w:lvlText w:val="o"/>
+      <w:lvlJc w:val="left"/>
+      <w:pPr>
+        <w:ind w:left="3600" w:hanging="360"/>
+      </w:pPr>
+      <w:rPr>
+        <w:rFonts w:ascii="Courier New" w:hAnsi="Courier New" w:cs="Courier New" w:hint="default"/>
+      </w:rPr>
+    </w:lvl>
+    <w:lvl w:ilvl="5" w:tplc="18090005" w:tentative="1">
+      <w:start w:val="1"/>
+      <w:numFmt w:val="bullet"/>
+      <w:lvlText w:val=""/>
+      <w:lvlJc w:val="left"/>
+      <w:pPr>
+        <w:ind w:left="4320" w:hanging="360"/>
+      </w:pPr>
+      <w:rPr>
+        <w:rFonts w:ascii="Wingdings" w:hAnsi="Wingdings" w:hint="default"/>
+      </w:rPr>
+    </w:lvl>
+    <w:lvl w:ilvl="6" w:tplc="18090001" w:tentative="1">
+      <w:start w:val="1"/>
+      <w:numFmt w:val="bullet"/>
+      <w:lvlText w:val=""/>
+      <w:lvlJc w:val="left"/>
+      <w:pPr>
+        <w:ind w:left="5040" w:hanging="360"/>
+      </w:pPr>
+      <w:rPr>
+        <w:rFonts w:ascii="Symbol" w:hAnsi="Symbol" w:hint="default"/>
+      </w:rPr>
+    </w:lvl>
+    <w:lvl w:ilvl="7" w:tplc="18090003" w:tentative="1">
+      <w:start w:val="1"/>
+      <w:numFmt w:val="bullet"/>
+      <w:lvlText w:val="o"/>
+      <w:lvlJc w:val="left"/>
+      <w:pPr>
+        <w:ind w:left="5760" w:hanging="360"/>
+      </w:pPr>
+      <w:rPr>
+        <w:rFonts w:ascii="Courier New" w:hAnsi="Courier New" w:cs="Courier New" w:hint="default"/>
+      </w:rPr>
+    </w:lvl>
+    <w:lvl w:ilvl="8" w:tplc="18090005" w:tentative="1">
+      <w:start w:val="1"/>
+      <w:numFmt w:val="bullet"/>
+      <w:lvlText w:val=""/>
+      <w:lvlJc w:val="left"/>
+      <w:pPr>
+        <w:ind w:left="6480" w:hanging="360"/>
+      </w:pPr>
+      <w:rPr>
+        <w:rFonts w:ascii="Wingdings" w:hAnsi="Wingdings" w:hint="default"/>
+      </w:rPr>
+    </w:lvl>
+  </w:abstractNum>
+  <w:abstractNum w:abstractNumId="4" w15:restartNumberingAfterBreak="0">
     <w:nsid w:val="64CA5392"/>
     <w:multiLevelType w:val="hybridMultilevel"/>
     <w:tmpl w:val="BFBC3626"/>
@@ -1195,7 +1635,7 @@
       </w:rPr>
     </w:lvl>
   </w:abstractNum>
-  <w:abstractNum w:abstractNumId="3" w15:restartNumberingAfterBreak="0">
+  <w:abstractNum w:abstractNumId="5" w15:restartNumberingAfterBreak="0">
     <w:nsid w:val="729B6EA2"/>
     <w:multiLevelType w:val="hybridMultilevel"/>
     <w:tmpl w:val="1EE6D64A"/>
@@ -1308,7 +1748,7 @@
       </w:rPr>
     </w:lvl>
   </w:abstractNum>
-  <w:abstractNum w:abstractNumId="4" w15:restartNumberingAfterBreak="0">
+  <w:abstractNum w:abstractNumId="6" w15:restartNumberingAfterBreak="0">
     <w:nsid w:val="72C54B81"/>
     <w:multiLevelType w:val="hybridMultilevel"/>
     <w:tmpl w:val="A9B03FF6"/>
@@ -1421,7 +1861,7 @@
       </w:rPr>
     </w:lvl>
   </w:abstractNum>
-  <w:abstractNum w:abstractNumId="5" w15:restartNumberingAfterBreak="0">
+  <w:abstractNum w:abstractNumId="7" w15:restartNumberingAfterBreak="0">
     <w:nsid w:val="78DD7E30"/>
     <w:multiLevelType w:val="hybridMultilevel"/>
     <w:tmpl w:val="148EE08C"/>
@@ -1535,22 +1975,28 @@
     </w:lvl>
   </w:abstractNum>
   <w:num w:numId="1" w16cid:durableId="667363523">
+    <w:abstractNumId w:val="5"/>
+  </w:num>
+  <w:num w:numId="2" w16cid:durableId="1938324952">
+    <w:abstractNumId w:val="1"/>
+  </w:num>
+  <w:num w:numId="3" w16cid:durableId="1044866364">
+    <w:abstractNumId w:val="7"/>
+  </w:num>
+  <w:num w:numId="4" w16cid:durableId="1944680418">
+    <w:abstractNumId w:val="6"/>
+  </w:num>
+  <w:num w:numId="5" w16cid:durableId="1015305127">
+    <w:abstractNumId w:val="4"/>
+  </w:num>
+  <w:num w:numId="6" w16cid:durableId="1163349641">
+    <w:abstractNumId w:val="2"/>
+  </w:num>
+  <w:num w:numId="7" w16cid:durableId="1964456558">
     <w:abstractNumId w:val="3"/>
   </w:num>
-  <w:num w:numId="2" w16cid:durableId="1938324952">
+  <w:num w:numId="8" w16cid:durableId="1152865749">
     <w:abstractNumId w:val="0"/>
-  </w:num>
-  <w:num w:numId="3" w16cid:durableId="1044866364">
-    <w:abstractNumId w:val="5"/>
-  </w:num>
-  <w:num w:numId="4" w16cid:durableId="1944680418">
-    <w:abstractNumId w:val="4"/>
-  </w:num>
-  <w:num w:numId="5" w16cid:durableId="1015305127">
-    <w:abstractNumId w:val="2"/>
-  </w:num>
-  <w:num w:numId="6" w16cid:durableId="1163349641">
-    <w:abstractNumId w:val="1"/>
   </w:num>
 </w:numbering>
 </file>
@@ -2472,6 +2918,29 @@
       <w:spacing w:val="5"/>
     </w:rPr>
   </w:style>
+  <w:style w:type="character" w:styleId="Hyperlink">
+    <w:name w:val="Hyperlink"/>
+    <w:basedOn w:val="DefaultParagraphFont"/>
+    <w:uiPriority w:val="99"/>
+    <w:unhideWhenUsed/>
+    <w:rsid w:val="00E23B13"/>
+    <w:rPr>
+      <w:color w:val="467886" w:themeColor="hyperlink"/>
+      <w:u w:val="single"/>
+    </w:rPr>
+  </w:style>
+  <w:style w:type="character" w:styleId="UnresolvedMention">
+    <w:name w:val="Unresolved Mention"/>
+    <w:basedOn w:val="DefaultParagraphFont"/>
+    <w:uiPriority w:val="99"/>
+    <w:semiHidden/>
+    <w:unhideWhenUsed/>
+    <w:rsid w:val="00E23B13"/>
+    <w:rPr>
+      <w:color w:val="605E5C"/>
+      <w:shd w:val="clear" w:color="auto" w:fill="E1DFDD"/>
+    </w:rPr>
+  </w:style>
 </w:styles>
 </file>
 

</xml_diff>

<commit_message>
finished adding comments and final sections
</commit_message>
<xml_diff>
--- a/Diary for project.docx
+++ b/Diary for project.docx
@@ -799,6 +799,65 @@
       </w:r>
       <w:r>
         <w:t>work on final report</w:t>
+      </w:r>
+    </w:p>
+    <w:p>
+      <w:pPr>
+        <w:pStyle w:val="ListParagraph"/>
+        <w:numPr>
+          <w:ilvl w:val="0"/>
+          <w:numId w:val="8"/>
+        </w:numPr>
+      </w:pPr>
+      <w:r>
+        <w:t>Added in non-phishing simulations</w:t>
+      </w:r>
+    </w:p>
+    <w:p>
+      <w:pPr>
+        <w:pStyle w:val="ListParagraph"/>
+        <w:numPr>
+          <w:ilvl w:val="0"/>
+          <w:numId w:val="8"/>
+        </w:numPr>
+      </w:pPr>
+      <w:r>
+        <w:t>Added in google template to improve u/i</w:t>
+      </w:r>
+    </w:p>
+    <w:p>
+      <w:pPr>
+        <w:rPr>
+          <w:b/>
+          <w:bCs/>
+        </w:rPr>
+      </w:pPr>
+      <w:r>
+        <w:rPr>
+          <w:b/>
+          <w:bCs/>
+        </w:rPr>
+        <w:t>16/03/2026</w:t>
+      </w:r>
+    </w:p>
+    <w:p>
+      <w:pPr>
+        <w:pStyle w:val="ListParagraph"/>
+        <w:numPr>
+          <w:ilvl w:val="0"/>
+          <w:numId w:val="9"/>
+        </w:numPr>
+        <w:rPr>
+          <w:b/>
+          <w:bCs/>
+        </w:rPr>
+      </w:pPr>
+      <w:r>
+        <w:rPr>
+          <w:b/>
+          <w:bCs/>
+        </w:rPr>
+        <w:t>Started Final report</w:t>
       </w:r>
     </w:p>
     <w:p/>
@@ -1071,6 +1130,119 @@
 <file path=word/numbering.xml><?xml version="1.0" encoding="utf-8"?>
 <w:numbering xmlns:wpc="http://schemas.microsoft.com/office/word/2010/wordprocessingCanvas" xmlns:cx="http://schemas.microsoft.com/office/drawing/2014/chartex" xmlns:cx1="http://schemas.microsoft.com/office/drawing/2015/9/8/chartex" xmlns:cx2="http://schemas.microsoft.com/office/drawing/2015/10/21/chartex" xmlns:cx3="http://schemas.microsoft.com/office/drawing/2016/5/9/chartex" xmlns:cx4="http://schemas.microsoft.com/office/drawing/2016/5/10/chartex" xmlns:cx5="http://schemas.microsoft.com/office/drawing/2016/5/11/chartex" xmlns:cx6="http://schemas.microsoft.com/office/drawing/2016/5/12/chartex" xmlns:cx7="http://schemas.microsoft.com/office/drawing/2016/5/13/chartex" xmlns:cx8="http://schemas.microsoft.com/office/drawing/2016/5/14/chartex" xmlns:mc="http://schemas.openxmlformats.org/markup-compatibility/2006" xmlns:aink="http://schemas.microsoft.com/office/drawing/2016/ink" xmlns:am3d="http://schemas.microsoft.com/office/drawing/2017/model3d" xmlns:o="urn:schemas-microsoft-com:office:office" xmlns:oel="http://schemas.microsoft.com/office/2019/extlst" xmlns:r="http://schemas.openxmlformats.org/officeDocument/2006/relationships" xmlns:m="http://schemas.openxmlformats.org/officeDocument/2006/math" xmlns:v="urn:schemas-microsoft-com:vml" xmlns:wp14="http://schemas.microsoft.com/office/word/2010/wordprocessingDrawing" xmlns:wp="http://schemas.openxmlformats.org/drawingml/2006/wordprocessingDrawing" xmlns:w10="urn:schemas-microsoft-com:office:word" xmlns:w="http://schemas.openxmlformats.org/wordprocessingml/2006/main" xmlns:w14="http://schemas.microsoft.com/office/word/2010/wordml" xmlns:w15="http://schemas.microsoft.com/office/word/2012/wordml" xmlns:w16cex="http://schemas.microsoft.com/office/word/2018/wordml/cex" xmlns:w16cid="http://schemas.microsoft.com/office/word/2016/wordml/cid" xmlns:w16="http://schemas.microsoft.com/office/word/2018/wordml" xmlns:w16du="http://schemas.microsoft.com/office/word/2023/wordml/word16du" xmlns:w16sdtdh="http://schemas.microsoft.com/office/word/2020/wordml/sdtdatahash" xmlns:w16sdtfl="http://schemas.microsoft.com/office/word/2024/wordml/sdtformatlock" xmlns:w16se="http://schemas.microsoft.com/office/word/2015/wordml/symex" xmlns:wpg="http://schemas.microsoft.com/office/word/2010/wordprocessingGroup" xmlns:wpi="http://schemas.microsoft.com/office/word/2010/wordprocessingInk" xmlns:wne="http://schemas.microsoft.com/office/word/2006/wordml" xmlns:wps="http://schemas.microsoft.com/office/word/2010/wordprocessingShape" mc:Ignorable="w14 w15 w16se w16cid w16 w16cex w16sdtdh w16sdtfl w16du wp14">
   <w:abstractNum w:abstractNumId="0" w15:restartNumberingAfterBreak="0">
+    <w:nsid w:val="1254446B"/>
+    <w:multiLevelType w:val="hybridMultilevel"/>
+    <w:tmpl w:val="E7B6DA56"/>
+    <w:lvl w:ilvl="0" w:tplc="18090001">
+      <w:start w:val="1"/>
+      <w:numFmt w:val="bullet"/>
+      <w:lvlText w:val=""/>
+      <w:lvlJc w:val="left"/>
+      <w:pPr>
+        <w:ind w:left="720" w:hanging="360"/>
+      </w:pPr>
+      <w:rPr>
+        <w:rFonts w:ascii="Symbol" w:hAnsi="Symbol" w:hint="default"/>
+      </w:rPr>
+    </w:lvl>
+    <w:lvl w:ilvl="1" w:tplc="18090003" w:tentative="1">
+      <w:start w:val="1"/>
+      <w:numFmt w:val="bullet"/>
+      <w:lvlText w:val="o"/>
+      <w:lvlJc w:val="left"/>
+      <w:pPr>
+        <w:ind w:left="1440" w:hanging="360"/>
+      </w:pPr>
+      <w:rPr>
+        <w:rFonts w:ascii="Courier New" w:hAnsi="Courier New" w:cs="Courier New" w:hint="default"/>
+      </w:rPr>
+    </w:lvl>
+    <w:lvl w:ilvl="2" w:tplc="18090005" w:tentative="1">
+      <w:start w:val="1"/>
+      <w:numFmt w:val="bullet"/>
+      <w:lvlText w:val=""/>
+      <w:lvlJc w:val="left"/>
+      <w:pPr>
+        <w:ind w:left="2160" w:hanging="360"/>
+      </w:pPr>
+      <w:rPr>
+        <w:rFonts w:ascii="Wingdings" w:hAnsi="Wingdings" w:hint="default"/>
+      </w:rPr>
+    </w:lvl>
+    <w:lvl w:ilvl="3" w:tplc="18090001" w:tentative="1">
+      <w:start w:val="1"/>
+      <w:numFmt w:val="bullet"/>
+      <w:lvlText w:val=""/>
+      <w:lvlJc w:val="left"/>
+      <w:pPr>
+        <w:ind w:left="2880" w:hanging="360"/>
+      </w:pPr>
+      <w:rPr>
+        <w:rFonts w:ascii="Symbol" w:hAnsi="Symbol" w:hint="default"/>
+      </w:rPr>
+    </w:lvl>
+    <w:lvl w:ilvl="4" w:tplc="18090003" w:tentative="1">
+      <w:start w:val="1"/>
+      <w:numFmt w:val="bullet"/>
+      <w:lvlText w:val="o"/>
+      <w:lvlJc w:val="left"/>
+      <w:pPr>
+        <w:ind w:left="3600" w:hanging="360"/>
+      </w:pPr>
+      <w:rPr>
+        <w:rFonts w:ascii="Courier New" w:hAnsi="Courier New" w:cs="Courier New" w:hint="default"/>
+      </w:rPr>
+    </w:lvl>
+    <w:lvl w:ilvl="5" w:tplc="18090005" w:tentative="1">
+      <w:start w:val="1"/>
+      <w:numFmt w:val="bullet"/>
+      <w:lvlText w:val=""/>
+      <w:lvlJc w:val="left"/>
+      <w:pPr>
+        <w:ind w:left="4320" w:hanging="360"/>
+      </w:pPr>
+      <w:rPr>
+        <w:rFonts w:ascii="Wingdings" w:hAnsi="Wingdings" w:hint="default"/>
+      </w:rPr>
+    </w:lvl>
+    <w:lvl w:ilvl="6" w:tplc="18090001" w:tentative="1">
+      <w:start w:val="1"/>
+      <w:numFmt w:val="bullet"/>
+      <w:lvlText w:val=""/>
+      <w:lvlJc w:val="left"/>
+      <w:pPr>
+        <w:ind w:left="5040" w:hanging="360"/>
+      </w:pPr>
+      <w:rPr>
+        <w:rFonts w:ascii="Symbol" w:hAnsi="Symbol" w:hint="default"/>
+      </w:rPr>
+    </w:lvl>
+    <w:lvl w:ilvl="7" w:tplc="18090003" w:tentative="1">
+      <w:start w:val="1"/>
+      <w:numFmt w:val="bullet"/>
+      <w:lvlText w:val="o"/>
+      <w:lvlJc w:val="left"/>
+      <w:pPr>
+        <w:ind w:left="5760" w:hanging="360"/>
+      </w:pPr>
+      <w:rPr>
+        <w:rFonts w:ascii="Courier New" w:hAnsi="Courier New" w:cs="Courier New" w:hint="default"/>
+      </w:rPr>
+    </w:lvl>
+    <w:lvl w:ilvl="8" w:tplc="18090005" w:tentative="1">
+      <w:start w:val="1"/>
+      <w:numFmt w:val="bullet"/>
+      <w:lvlText w:val=""/>
+      <w:lvlJc w:val="left"/>
+      <w:pPr>
+        <w:ind w:left="6480" w:hanging="360"/>
+      </w:pPr>
+      <w:rPr>
+        <w:rFonts w:ascii="Wingdings" w:hAnsi="Wingdings" w:hint="default"/>
+      </w:rPr>
+    </w:lvl>
+  </w:abstractNum>
+  <w:abstractNum w:abstractNumId="1" w15:restartNumberingAfterBreak="0">
     <w:nsid w:val="1A463877"/>
     <w:multiLevelType w:val="hybridMultilevel"/>
     <w:tmpl w:val="BFA80A26"/>
@@ -1183,7 +1355,7 @@
       </w:rPr>
     </w:lvl>
   </w:abstractNum>
-  <w:abstractNum w:abstractNumId="1" w15:restartNumberingAfterBreak="0">
+  <w:abstractNum w:abstractNumId="2" w15:restartNumberingAfterBreak="0">
     <w:nsid w:val="1F953D3F"/>
     <w:multiLevelType w:val="hybridMultilevel"/>
     <w:tmpl w:val="20442008"/>
@@ -1296,7 +1468,7 @@
       </w:rPr>
     </w:lvl>
   </w:abstractNum>
-  <w:abstractNum w:abstractNumId="2" w15:restartNumberingAfterBreak="0">
+  <w:abstractNum w:abstractNumId="3" w15:restartNumberingAfterBreak="0">
     <w:nsid w:val="2C8658B3"/>
     <w:multiLevelType w:val="hybridMultilevel"/>
     <w:tmpl w:val="C8B08D0A"/>
@@ -1409,7 +1581,7 @@
       </w:rPr>
     </w:lvl>
   </w:abstractNum>
-  <w:abstractNum w:abstractNumId="3" w15:restartNumberingAfterBreak="0">
+  <w:abstractNum w:abstractNumId="4" w15:restartNumberingAfterBreak="0">
     <w:nsid w:val="4A945192"/>
     <w:multiLevelType w:val="hybridMultilevel"/>
     <w:tmpl w:val="93581D76"/>
@@ -1522,7 +1694,7 @@
       </w:rPr>
     </w:lvl>
   </w:abstractNum>
-  <w:abstractNum w:abstractNumId="4" w15:restartNumberingAfterBreak="0">
+  <w:abstractNum w:abstractNumId="5" w15:restartNumberingAfterBreak="0">
     <w:nsid w:val="64CA5392"/>
     <w:multiLevelType w:val="hybridMultilevel"/>
     <w:tmpl w:val="BFBC3626"/>
@@ -1635,7 +1807,7 @@
       </w:rPr>
     </w:lvl>
   </w:abstractNum>
-  <w:abstractNum w:abstractNumId="5" w15:restartNumberingAfterBreak="0">
+  <w:abstractNum w:abstractNumId="6" w15:restartNumberingAfterBreak="0">
     <w:nsid w:val="729B6EA2"/>
     <w:multiLevelType w:val="hybridMultilevel"/>
     <w:tmpl w:val="1EE6D64A"/>
@@ -1748,7 +1920,7 @@
       </w:rPr>
     </w:lvl>
   </w:abstractNum>
-  <w:abstractNum w:abstractNumId="6" w15:restartNumberingAfterBreak="0">
+  <w:abstractNum w:abstractNumId="7" w15:restartNumberingAfterBreak="0">
     <w:nsid w:val="72C54B81"/>
     <w:multiLevelType w:val="hybridMultilevel"/>
     <w:tmpl w:val="A9B03FF6"/>
@@ -1861,7 +2033,7 @@
       </w:rPr>
     </w:lvl>
   </w:abstractNum>
-  <w:abstractNum w:abstractNumId="7" w15:restartNumberingAfterBreak="0">
+  <w:abstractNum w:abstractNumId="8" w15:restartNumberingAfterBreak="0">
     <w:nsid w:val="78DD7E30"/>
     <w:multiLevelType w:val="hybridMultilevel"/>
     <w:tmpl w:val="148EE08C"/>
@@ -1975,27 +2147,30 @@
     </w:lvl>
   </w:abstractNum>
   <w:num w:numId="1" w16cid:durableId="667363523">
+    <w:abstractNumId w:val="6"/>
+  </w:num>
+  <w:num w:numId="2" w16cid:durableId="1938324952">
+    <w:abstractNumId w:val="2"/>
+  </w:num>
+  <w:num w:numId="3" w16cid:durableId="1044866364">
+    <w:abstractNumId w:val="8"/>
+  </w:num>
+  <w:num w:numId="4" w16cid:durableId="1944680418">
+    <w:abstractNumId w:val="7"/>
+  </w:num>
+  <w:num w:numId="5" w16cid:durableId="1015305127">
     <w:abstractNumId w:val="5"/>
   </w:num>
-  <w:num w:numId="2" w16cid:durableId="1938324952">
+  <w:num w:numId="6" w16cid:durableId="1163349641">
+    <w:abstractNumId w:val="3"/>
+  </w:num>
+  <w:num w:numId="7" w16cid:durableId="1964456558">
+    <w:abstractNumId w:val="4"/>
+  </w:num>
+  <w:num w:numId="8" w16cid:durableId="1152865749">
     <w:abstractNumId w:val="1"/>
   </w:num>
-  <w:num w:numId="3" w16cid:durableId="1044866364">
-    <w:abstractNumId w:val="7"/>
-  </w:num>
-  <w:num w:numId="4" w16cid:durableId="1944680418">
-    <w:abstractNumId w:val="6"/>
-  </w:num>
-  <w:num w:numId="5" w16cid:durableId="1015305127">
-    <w:abstractNumId w:val="4"/>
-  </w:num>
-  <w:num w:numId="6" w16cid:durableId="1163349641">
-    <w:abstractNumId w:val="2"/>
-  </w:num>
-  <w:num w:numId="7" w16cid:durableId="1964456558">
-    <w:abstractNumId w:val="3"/>
-  </w:num>
-  <w:num w:numId="8" w16cid:durableId="1152865749">
+  <w:num w:numId="9" w16cid:durableId="1961522577">
     <w:abstractNumId w:val="0"/>
   </w:num>
 </w:numbering>

</xml_diff>

<commit_message>
trying to fix firebase config to fix render
</commit_message>
<xml_diff>
--- a/Diary for project.docx
+++ b/Diary for project.docx
@@ -44,7 +44,15 @@
         </w:numPr>
       </w:pPr>
       <w:r>
-        <w:t xml:space="preserve">Made Lists of context and Started introduction </w:t>
+        <w:t xml:space="preserve">Made Lists of </w:t>
+      </w:r>
+      <w:proofErr w:type="gramStart"/>
+      <w:r>
+        <w:t>context</w:t>
+      </w:r>
+      <w:proofErr w:type="gramEnd"/>
+      <w:r>
+        <w:t xml:space="preserve"> and Started introduction </w:t>
       </w:r>
     </w:p>
     <w:p>
@@ -532,8 +540,13 @@
         </w:numPr>
       </w:pPr>
       <w:r>
-        <w:t>Create campgin</w:t>
-      </w:r>
+        <w:t xml:space="preserve">Create </w:t>
+      </w:r>
+      <w:proofErr w:type="spellStart"/>
+      <w:r>
+        <w:t>campgin</w:t>
+      </w:r>
+      <w:proofErr w:type="spellEnd"/>
     </w:p>
     <w:p>
       <w:pPr>
@@ -595,7 +608,15 @@
         </w:numPr>
       </w:pPr>
       <w:r>
-        <w:t>Created Models.py to comtrol results table and campaign tables</w:t>
+        <w:t xml:space="preserve">Created Models.py to </w:t>
+      </w:r>
+      <w:proofErr w:type="spellStart"/>
+      <w:r>
+        <w:t>comtrol</w:t>
+      </w:r>
+      <w:proofErr w:type="spellEnd"/>
+      <w:r>
+        <w:t xml:space="preserve"> results table and campaign tables</w:t>
       </w:r>
     </w:p>
     <w:p>
@@ -743,6 +764,27 @@
           <w:bCs/>
         </w:rPr>
       </w:pPr>
+      <w:proofErr w:type="spellStart"/>
+      <w:r>
+        <w:t>Passowrd</w:t>
+      </w:r>
+      <w:proofErr w:type="spellEnd"/>
+      <w:r>
+        <w:t xml:space="preserve"> strength test</w:t>
+      </w:r>
+    </w:p>
+    <w:p>
+      <w:pPr>
+        <w:pStyle w:val="ListParagraph"/>
+        <w:numPr>
+          <w:ilvl w:val="0"/>
+          <w:numId w:val="7"/>
+        </w:numPr>
+        <w:rPr>
+          <w:b/>
+          <w:bCs/>
+        </w:rPr>
+      </w:pPr>
       <w:r>
         <w:rPr>
           <w:b/>
@@ -753,26 +795,6 @@
     </w:p>
     <w:p>
       <w:pPr>
-        <w:pStyle w:val="ListParagraph"/>
-        <w:numPr>
-          <w:ilvl w:val="0"/>
-          <w:numId w:val="7"/>
-        </w:numPr>
-        <w:rPr>
-          <w:b/>
-          <w:bCs/>
-        </w:rPr>
-      </w:pPr>
-      <w:r>
-        <w:rPr>
-          <w:b/>
-          <w:bCs/>
-        </w:rPr>
-        <w:t>..</w:t>
-      </w:r>
-    </w:p>
-    <w:p>
-      <w:pPr>
         <w:rPr>
           <w:b/>
           <w:bCs/>
@@ -822,8 +844,13 @@
         </w:numPr>
       </w:pPr>
       <w:r>
-        <w:t>Added in google template to improve u/i</w:t>
-      </w:r>
+        <w:t>Added in google template to improve u/</w:t>
+      </w:r>
+      <w:proofErr w:type="spellStart"/>
+      <w:r>
+        <w:t>i</w:t>
+      </w:r>
+      <w:proofErr w:type="spellEnd"/>
     </w:p>
     <w:p>
       <w:pPr>
@@ -845,20 +872,152 @@
         <w:pStyle w:val="ListParagraph"/>
         <w:numPr>
           <w:ilvl w:val="0"/>
-          <w:numId w:val="9"/>
-        </w:numPr>
-        <w:rPr>
-          <w:b/>
-          <w:bCs/>
-        </w:rPr>
-      </w:pPr>
-      <w:r>
-        <w:rPr>
-          <w:b/>
-          <w:bCs/>
-        </w:rPr>
-        <w:t>Started Final report</w:t>
-      </w:r>
+          <w:numId w:val="12"/>
+        </w:numPr>
+      </w:pPr>
+      <w:r>
+        <w:t>Added comments to uncommented code</w:t>
+      </w:r>
+    </w:p>
+    <w:p>
+      <w:pPr>
+        <w:rPr>
+          <w:b/>
+          <w:bCs/>
+        </w:rPr>
+      </w:pPr>
+      <w:r>
+        <w:rPr>
+          <w:b/>
+          <w:bCs/>
+        </w:rPr>
+        <w:t>19/03/26</w:t>
+      </w:r>
+    </w:p>
+    <w:p>
+      <w:pPr>
+        <w:pStyle w:val="ListParagraph"/>
+        <w:numPr>
+          <w:ilvl w:val="0"/>
+          <w:numId w:val="11"/>
+        </w:numPr>
+      </w:pPr>
+      <w:r>
+        <w:lastRenderedPageBreak/>
+        <w:t>Working on report</w:t>
+      </w:r>
+    </w:p>
+    <w:p>
+      <w:pPr>
+        <w:pStyle w:val="ListParagraph"/>
+        <w:numPr>
+          <w:ilvl w:val="0"/>
+          <w:numId w:val="11"/>
+        </w:numPr>
+      </w:pPr>
+      <w:r>
+        <w:t xml:space="preserve">Adding more </w:t>
+      </w:r>
+      <w:proofErr w:type="spellStart"/>
+      <w:r>
+        <w:t>pytests</w:t>
+      </w:r>
+      <w:proofErr w:type="spellEnd"/>
+      <w:r>
+        <w:t xml:space="preserve"> to website</w:t>
+      </w:r>
+    </w:p>
+    <w:p>
+      <w:pPr>
+        <w:pStyle w:val="ListParagraph"/>
+        <w:numPr>
+          <w:ilvl w:val="0"/>
+          <w:numId w:val="11"/>
+        </w:numPr>
+      </w:pPr>
+      <w:r>
+        <w:t>Added right/wrong to answers on phishing emails</w:t>
+      </w:r>
+    </w:p>
+    <w:p>
+      <w:pPr>
+        <w:pStyle w:val="ListParagraph"/>
+        <w:numPr>
+          <w:ilvl w:val="0"/>
+          <w:numId w:val="11"/>
+        </w:numPr>
+      </w:pPr>
+      <w:r>
+        <w:t xml:space="preserve">Change to </w:t>
+      </w:r>
+      <w:proofErr w:type="spellStart"/>
+      <w:r>
+        <w:t>firestore</w:t>
+      </w:r>
+      <w:proofErr w:type="spellEnd"/>
+      <w:r>
+        <w:t xml:space="preserve"> from SQL</w:t>
+      </w:r>
+    </w:p>
+    <w:p>
+      <w:pPr>
+        <w:rPr>
+          <w:b/>
+          <w:bCs/>
+        </w:rPr>
+      </w:pPr>
+      <w:r>
+        <w:rPr>
+          <w:b/>
+          <w:bCs/>
+        </w:rPr>
+        <w:t>20/03/26</w:t>
+      </w:r>
+    </w:p>
+    <w:p>
+      <w:pPr>
+        <w:pStyle w:val="ListParagraph"/>
+        <w:numPr>
+          <w:ilvl w:val="0"/>
+          <w:numId w:val="10"/>
+        </w:numPr>
+      </w:pPr>
+      <w:r>
+        <w:t>Got render working and deployed</w:t>
+      </w:r>
+    </w:p>
+    <w:p>
+      <w:pPr>
+        <w:pStyle w:val="ListParagraph"/>
+        <w:numPr>
+          <w:ilvl w:val="0"/>
+          <w:numId w:val="10"/>
+        </w:numPr>
+      </w:pPr>
+      <w:r>
+        <w:t>Making sure everything is ready for testing</w:t>
+      </w:r>
+    </w:p>
+    <w:p>
+      <w:pPr>
+        <w:pStyle w:val="ListParagraph"/>
+        <w:numPr>
+          <w:ilvl w:val="0"/>
+          <w:numId w:val="10"/>
+        </w:numPr>
+      </w:pPr>
+      <w:r>
+        <w:t>Kept working on report</w:t>
+      </w:r>
+    </w:p>
+    <w:p/>
+    <w:p>
+      <w:pPr>
+        <w:rPr>
+          <w:b/>
+          <w:bCs/>
+        </w:rPr>
+      </w:pPr>
     </w:p>
     <w:p/>
     <w:p>
@@ -891,9 +1050,19 @@
         </w:r>
       </w:hyperlink>
     </w:p>
+    <w:p>
+      <w:hyperlink r:id="rId8" w:history="1">
+        <w:r>
+          <w:rPr>
+            <w:rStyle w:val="Hyperlink"/>
+          </w:rPr>
+          <w:t>https://docs.pytest.org/en/stable/how-to/index.html</w:t>
+        </w:r>
+      </w:hyperlink>
+    </w:p>
     <w:p/>
     <w:p>
-      <w:hyperlink r:id="rId8" w:history="1">
+      <w:hyperlink r:id="rId9" w:history="1">
         <w:r>
           <w:rPr>
             <w:rStyle w:val="Hyperlink"/>
@@ -928,6 +1097,7 @@
           <w:bCs/>
           <w:noProof/>
         </w:rPr>
+        <w:lastRenderedPageBreak/>
         <w:drawing>
           <wp:inline distT="0" distB="0" distL="0" distR="0" wp14:anchorId="7B5F6C25" wp14:editId="1BD0B840">
             <wp:extent cx="5731510" cy="3295650"/>
@@ -944,7 +1114,7 @@
                     <pic:cNvPicPr/>
                   </pic:nvPicPr>
                   <pic:blipFill>
-                    <a:blip r:embed="rId9"/>
+                    <a:blip r:embed="rId10"/>
                     <a:stretch>
                       <a:fillRect/>
                     </a:stretch>
@@ -978,7 +1148,6 @@
           <w:bCs/>
           <w:noProof/>
         </w:rPr>
-        <w:lastRenderedPageBreak/>
         <w:drawing>
           <wp:inline distT="0" distB="0" distL="0" distR="0" wp14:anchorId="7C0A0824" wp14:editId="36CC7D66">
             <wp:extent cx="5731510" cy="4149725"/>
@@ -995,7 +1164,7 @@
                     <pic:cNvPicPr/>
                   </pic:nvPicPr>
                   <pic:blipFill>
-                    <a:blip r:embed="rId10"/>
+                    <a:blip r:embed="rId11"/>
                     <a:stretch>
                       <a:fillRect/>
                     </a:stretch>
@@ -1029,6 +1198,7 @@
           <w:bCs/>
           <w:noProof/>
         </w:rPr>
+        <w:lastRenderedPageBreak/>
         <w:drawing>
           <wp:inline distT="0" distB="0" distL="0" distR="0" wp14:anchorId="42772C21" wp14:editId="280DB156">
             <wp:extent cx="5731510" cy="3430905"/>
@@ -1045,7 +1215,7 @@
                     <pic:cNvPicPr/>
                   </pic:nvPicPr>
                   <pic:blipFill>
-                    <a:blip r:embed="rId11"/>
+                    <a:blip r:embed="rId12"/>
                     <a:stretch>
                       <a:fillRect/>
                     </a:stretch>
@@ -1079,7 +1249,6 @@
           <w:bCs/>
           <w:noProof/>
         </w:rPr>
-        <w:lastRenderedPageBreak/>
         <w:drawing>
           <wp:inline distT="0" distB="0" distL="0" distR="0" wp14:anchorId="3A7B0526" wp14:editId="233A4F18">
             <wp:extent cx="5731510" cy="2856865"/>
@@ -1096,7 +1265,7 @@
                     <pic:cNvPicPr/>
                   </pic:nvPicPr>
                   <pic:blipFill>
-                    <a:blip r:embed="rId12"/>
+                    <a:blip r:embed="rId13"/>
                     <a:stretch>
                       <a:fillRect/>
                     </a:stretch>
@@ -1469,6 +1638,119 @@
     </w:lvl>
   </w:abstractNum>
   <w:abstractNum w:abstractNumId="3" w15:restartNumberingAfterBreak="0">
+    <w:nsid w:val="2BC1336D"/>
+    <w:multiLevelType w:val="hybridMultilevel"/>
+    <w:tmpl w:val="22581356"/>
+    <w:lvl w:ilvl="0" w:tplc="18090001">
+      <w:start w:val="1"/>
+      <w:numFmt w:val="bullet"/>
+      <w:lvlText w:val=""/>
+      <w:lvlJc w:val="left"/>
+      <w:pPr>
+        <w:ind w:left="720" w:hanging="360"/>
+      </w:pPr>
+      <w:rPr>
+        <w:rFonts w:ascii="Symbol" w:hAnsi="Symbol" w:hint="default"/>
+      </w:rPr>
+    </w:lvl>
+    <w:lvl w:ilvl="1" w:tplc="18090003" w:tentative="1">
+      <w:start w:val="1"/>
+      <w:numFmt w:val="bullet"/>
+      <w:lvlText w:val="o"/>
+      <w:lvlJc w:val="left"/>
+      <w:pPr>
+        <w:ind w:left="1440" w:hanging="360"/>
+      </w:pPr>
+      <w:rPr>
+        <w:rFonts w:ascii="Courier New" w:hAnsi="Courier New" w:cs="Courier New" w:hint="default"/>
+      </w:rPr>
+    </w:lvl>
+    <w:lvl w:ilvl="2" w:tplc="18090005" w:tentative="1">
+      <w:start w:val="1"/>
+      <w:numFmt w:val="bullet"/>
+      <w:lvlText w:val=""/>
+      <w:lvlJc w:val="left"/>
+      <w:pPr>
+        <w:ind w:left="2160" w:hanging="360"/>
+      </w:pPr>
+      <w:rPr>
+        <w:rFonts w:ascii="Wingdings" w:hAnsi="Wingdings" w:hint="default"/>
+      </w:rPr>
+    </w:lvl>
+    <w:lvl w:ilvl="3" w:tplc="18090001" w:tentative="1">
+      <w:start w:val="1"/>
+      <w:numFmt w:val="bullet"/>
+      <w:lvlText w:val=""/>
+      <w:lvlJc w:val="left"/>
+      <w:pPr>
+        <w:ind w:left="2880" w:hanging="360"/>
+      </w:pPr>
+      <w:rPr>
+        <w:rFonts w:ascii="Symbol" w:hAnsi="Symbol" w:hint="default"/>
+      </w:rPr>
+    </w:lvl>
+    <w:lvl w:ilvl="4" w:tplc="18090003" w:tentative="1">
+      <w:start w:val="1"/>
+      <w:numFmt w:val="bullet"/>
+      <w:lvlText w:val="o"/>
+      <w:lvlJc w:val="left"/>
+      <w:pPr>
+        <w:ind w:left="3600" w:hanging="360"/>
+      </w:pPr>
+      <w:rPr>
+        <w:rFonts w:ascii="Courier New" w:hAnsi="Courier New" w:cs="Courier New" w:hint="default"/>
+      </w:rPr>
+    </w:lvl>
+    <w:lvl w:ilvl="5" w:tplc="18090005" w:tentative="1">
+      <w:start w:val="1"/>
+      <w:numFmt w:val="bullet"/>
+      <w:lvlText w:val=""/>
+      <w:lvlJc w:val="left"/>
+      <w:pPr>
+        <w:ind w:left="4320" w:hanging="360"/>
+      </w:pPr>
+      <w:rPr>
+        <w:rFonts w:ascii="Wingdings" w:hAnsi="Wingdings" w:hint="default"/>
+      </w:rPr>
+    </w:lvl>
+    <w:lvl w:ilvl="6" w:tplc="18090001" w:tentative="1">
+      <w:start w:val="1"/>
+      <w:numFmt w:val="bullet"/>
+      <w:lvlText w:val=""/>
+      <w:lvlJc w:val="left"/>
+      <w:pPr>
+        <w:ind w:left="5040" w:hanging="360"/>
+      </w:pPr>
+      <w:rPr>
+        <w:rFonts w:ascii="Symbol" w:hAnsi="Symbol" w:hint="default"/>
+      </w:rPr>
+    </w:lvl>
+    <w:lvl w:ilvl="7" w:tplc="18090003" w:tentative="1">
+      <w:start w:val="1"/>
+      <w:numFmt w:val="bullet"/>
+      <w:lvlText w:val="o"/>
+      <w:lvlJc w:val="left"/>
+      <w:pPr>
+        <w:ind w:left="5760" w:hanging="360"/>
+      </w:pPr>
+      <w:rPr>
+        <w:rFonts w:ascii="Courier New" w:hAnsi="Courier New" w:cs="Courier New" w:hint="default"/>
+      </w:rPr>
+    </w:lvl>
+    <w:lvl w:ilvl="8" w:tplc="18090005" w:tentative="1">
+      <w:start w:val="1"/>
+      <w:numFmt w:val="bullet"/>
+      <w:lvlText w:val=""/>
+      <w:lvlJc w:val="left"/>
+      <w:pPr>
+        <w:ind w:left="6480" w:hanging="360"/>
+      </w:pPr>
+      <w:rPr>
+        <w:rFonts w:ascii="Wingdings" w:hAnsi="Wingdings" w:hint="default"/>
+      </w:rPr>
+    </w:lvl>
+  </w:abstractNum>
+  <w:abstractNum w:abstractNumId="4" w15:restartNumberingAfterBreak="0">
     <w:nsid w:val="2C8658B3"/>
     <w:multiLevelType w:val="hybridMultilevel"/>
     <w:tmpl w:val="C8B08D0A"/>
@@ -1581,7 +1863,7 @@
       </w:rPr>
     </w:lvl>
   </w:abstractNum>
-  <w:abstractNum w:abstractNumId="4" w15:restartNumberingAfterBreak="0">
+  <w:abstractNum w:abstractNumId="5" w15:restartNumberingAfterBreak="0">
     <w:nsid w:val="4A945192"/>
     <w:multiLevelType w:val="hybridMultilevel"/>
     <w:tmpl w:val="93581D76"/>
@@ -1694,7 +1976,233 @@
       </w:rPr>
     </w:lvl>
   </w:abstractNum>
-  <w:abstractNum w:abstractNumId="5" w15:restartNumberingAfterBreak="0">
+  <w:abstractNum w:abstractNumId="6" w15:restartNumberingAfterBreak="0">
+    <w:nsid w:val="4C5474BD"/>
+    <w:multiLevelType w:val="hybridMultilevel"/>
+    <w:tmpl w:val="AA24B768"/>
+    <w:lvl w:ilvl="0" w:tplc="18090001">
+      <w:start w:val="1"/>
+      <w:numFmt w:val="bullet"/>
+      <w:lvlText w:val=""/>
+      <w:lvlJc w:val="left"/>
+      <w:pPr>
+        <w:ind w:left="720" w:hanging="360"/>
+      </w:pPr>
+      <w:rPr>
+        <w:rFonts w:ascii="Symbol" w:hAnsi="Symbol" w:hint="default"/>
+      </w:rPr>
+    </w:lvl>
+    <w:lvl w:ilvl="1" w:tplc="18090003" w:tentative="1">
+      <w:start w:val="1"/>
+      <w:numFmt w:val="bullet"/>
+      <w:lvlText w:val="o"/>
+      <w:lvlJc w:val="left"/>
+      <w:pPr>
+        <w:ind w:left="1440" w:hanging="360"/>
+      </w:pPr>
+      <w:rPr>
+        <w:rFonts w:ascii="Courier New" w:hAnsi="Courier New" w:cs="Courier New" w:hint="default"/>
+      </w:rPr>
+    </w:lvl>
+    <w:lvl w:ilvl="2" w:tplc="18090005" w:tentative="1">
+      <w:start w:val="1"/>
+      <w:numFmt w:val="bullet"/>
+      <w:lvlText w:val=""/>
+      <w:lvlJc w:val="left"/>
+      <w:pPr>
+        <w:ind w:left="2160" w:hanging="360"/>
+      </w:pPr>
+      <w:rPr>
+        <w:rFonts w:ascii="Wingdings" w:hAnsi="Wingdings" w:hint="default"/>
+      </w:rPr>
+    </w:lvl>
+    <w:lvl w:ilvl="3" w:tplc="18090001" w:tentative="1">
+      <w:start w:val="1"/>
+      <w:numFmt w:val="bullet"/>
+      <w:lvlText w:val=""/>
+      <w:lvlJc w:val="left"/>
+      <w:pPr>
+        <w:ind w:left="2880" w:hanging="360"/>
+      </w:pPr>
+      <w:rPr>
+        <w:rFonts w:ascii="Symbol" w:hAnsi="Symbol" w:hint="default"/>
+      </w:rPr>
+    </w:lvl>
+    <w:lvl w:ilvl="4" w:tplc="18090003" w:tentative="1">
+      <w:start w:val="1"/>
+      <w:numFmt w:val="bullet"/>
+      <w:lvlText w:val="o"/>
+      <w:lvlJc w:val="left"/>
+      <w:pPr>
+        <w:ind w:left="3600" w:hanging="360"/>
+      </w:pPr>
+      <w:rPr>
+        <w:rFonts w:ascii="Courier New" w:hAnsi="Courier New" w:cs="Courier New" w:hint="default"/>
+      </w:rPr>
+    </w:lvl>
+    <w:lvl w:ilvl="5" w:tplc="18090005" w:tentative="1">
+      <w:start w:val="1"/>
+      <w:numFmt w:val="bullet"/>
+      <w:lvlText w:val=""/>
+      <w:lvlJc w:val="left"/>
+      <w:pPr>
+        <w:ind w:left="4320" w:hanging="360"/>
+      </w:pPr>
+      <w:rPr>
+        <w:rFonts w:ascii="Wingdings" w:hAnsi="Wingdings" w:hint="default"/>
+      </w:rPr>
+    </w:lvl>
+    <w:lvl w:ilvl="6" w:tplc="18090001" w:tentative="1">
+      <w:start w:val="1"/>
+      <w:numFmt w:val="bullet"/>
+      <w:lvlText w:val=""/>
+      <w:lvlJc w:val="left"/>
+      <w:pPr>
+        <w:ind w:left="5040" w:hanging="360"/>
+      </w:pPr>
+      <w:rPr>
+        <w:rFonts w:ascii="Symbol" w:hAnsi="Symbol" w:hint="default"/>
+      </w:rPr>
+    </w:lvl>
+    <w:lvl w:ilvl="7" w:tplc="18090003" w:tentative="1">
+      <w:start w:val="1"/>
+      <w:numFmt w:val="bullet"/>
+      <w:lvlText w:val="o"/>
+      <w:lvlJc w:val="left"/>
+      <w:pPr>
+        <w:ind w:left="5760" w:hanging="360"/>
+      </w:pPr>
+      <w:rPr>
+        <w:rFonts w:ascii="Courier New" w:hAnsi="Courier New" w:cs="Courier New" w:hint="default"/>
+      </w:rPr>
+    </w:lvl>
+    <w:lvl w:ilvl="8" w:tplc="18090005" w:tentative="1">
+      <w:start w:val="1"/>
+      <w:numFmt w:val="bullet"/>
+      <w:lvlText w:val=""/>
+      <w:lvlJc w:val="left"/>
+      <w:pPr>
+        <w:ind w:left="6480" w:hanging="360"/>
+      </w:pPr>
+      <w:rPr>
+        <w:rFonts w:ascii="Wingdings" w:hAnsi="Wingdings" w:hint="default"/>
+      </w:rPr>
+    </w:lvl>
+  </w:abstractNum>
+  <w:abstractNum w:abstractNumId="7" w15:restartNumberingAfterBreak="0">
+    <w:nsid w:val="4F6467E9"/>
+    <w:multiLevelType w:val="hybridMultilevel"/>
+    <w:tmpl w:val="5602DAE6"/>
+    <w:lvl w:ilvl="0" w:tplc="18090001">
+      <w:start w:val="1"/>
+      <w:numFmt w:val="bullet"/>
+      <w:lvlText w:val=""/>
+      <w:lvlJc w:val="left"/>
+      <w:pPr>
+        <w:ind w:left="720" w:hanging="360"/>
+      </w:pPr>
+      <w:rPr>
+        <w:rFonts w:ascii="Symbol" w:hAnsi="Symbol" w:hint="default"/>
+      </w:rPr>
+    </w:lvl>
+    <w:lvl w:ilvl="1" w:tplc="18090003" w:tentative="1">
+      <w:start w:val="1"/>
+      <w:numFmt w:val="bullet"/>
+      <w:lvlText w:val="o"/>
+      <w:lvlJc w:val="left"/>
+      <w:pPr>
+        <w:ind w:left="1440" w:hanging="360"/>
+      </w:pPr>
+      <w:rPr>
+        <w:rFonts w:ascii="Courier New" w:hAnsi="Courier New" w:cs="Courier New" w:hint="default"/>
+      </w:rPr>
+    </w:lvl>
+    <w:lvl w:ilvl="2" w:tplc="18090005" w:tentative="1">
+      <w:start w:val="1"/>
+      <w:numFmt w:val="bullet"/>
+      <w:lvlText w:val=""/>
+      <w:lvlJc w:val="left"/>
+      <w:pPr>
+        <w:ind w:left="2160" w:hanging="360"/>
+      </w:pPr>
+      <w:rPr>
+        <w:rFonts w:ascii="Wingdings" w:hAnsi="Wingdings" w:hint="default"/>
+      </w:rPr>
+    </w:lvl>
+    <w:lvl w:ilvl="3" w:tplc="18090001" w:tentative="1">
+      <w:start w:val="1"/>
+      <w:numFmt w:val="bullet"/>
+      <w:lvlText w:val=""/>
+      <w:lvlJc w:val="left"/>
+      <w:pPr>
+        <w:ind w:left="2880" w:hanging="360"/>
+      </w:pPr>
+      <w:rPr>
+        <w:rFonts w:ascii="Symbol" w:hAnsi="Symbol" w:hint="default"/>
+      </w:rPr>
+    </w:lvl>
+    <w:lvl w:ilvl="4" w:tplc="18090003" w:tentative="1">
+      <w:start w:val="1"/>
+      <w:numFmt w:val="bullet"/>
+      <w:lvlText w:val="o"/>
+      <w:lvlJc w:val="left"/>
+      <w:pPr>
+        <w:ind w:left="3600" w:hanging="360"/>
+      </w:pPr>
+      <w:rPr>
+        <w:rFonts w:ascii="Courier New" w:hAnsi="Courier New" w:cs="Courier New" w:hint="default"/>
+      </w:rPr>
+    </w:lvl>
+    <w:lvl w:ilvl="5" w:tplc="18090005" w:tentative="1">
+      <w:start w:val="1"/>
+      <w:numFmt w:val="bullet"/>
+      <w:lvlText w:val=""/>
+      <w:lvlJc w:val="left"/>
+      <w:pPr>
+        <w:ind w:left="4320" w:hanging="360"/>
+      </w:pPr>
+      <w:rPr>
+        <w:rFonts w:ascii="Wingdings" w:hAnsi="Wingdings" w:hint="default"/>
+      </w:rPr>
+    </w:lvl>
+    <w:lvl w:ilvl="6" w:tplc="18090001" w:tentative="1">
+      <w:start w:val="1"/>
+      <w:numFmt w:val="bullet"/>
+      <w:lvlText w:val=""/>
+      <w:lvlJc w:val="left"/>
+      <w:pPr>
+        <w:ind w:left="5040" w:hanging="360"/>
+      </w:pPr>
+      <w:rPr>
+        <w:rFonts w:ascii="Symbol" w:hAnsi="Symbol" w:hint="default"/>
+      </w:rPr>
+    </w:lvl>
+    <w:lvl w:ilvl="7" w:tplc="18090003" w:tentative="1">
+      <w:start w:val="1"/>
+      <w:numFmt w:val="bullet"/>
+      <w:lvlText w:val="o"/>
+      <w:lvlJc w:val="left"/>
+      <w:pPr>
+        <w:ind w:left="5760" w:hanging="360"/>
+      </w:pPr>
+      <w:rPr>
+        <w:rFonts w:ascii="Courier New" w:hAnsi="Courier New" w:cs="Courier New" w:hint="default"/>
+      </w:rPr>
+    </w:lvl>
+    <w:lvl w:ilvl="8" w:tplc="18090005" w:tentative="1">
+      <w:start w:val="1"/>
+      <w:numFmt w:val="bullet"/>
+      <w:lvlText w:val=""/>
+      <w:lvlJc w:val="left"/>
+      <w:pPr>
+        <w:ind w:left="6480" w:hanging="360"/>
+      </w:pPr>
+      <w:rPr>
+        <w:rFonts w:ascii="Wingdings" w:hAnsi="Wingdings" w:hint="default"/>
+      </w:rPr>
+    </w:lvl>
+  </w:abstractNum>
+  <w:abstractNum w:abstractNumId="8" w15:restartNumberingAfterBreak="0">
     <w:nsid w:val="64CA5392"/>
     <w:multiLevelType w:val="hybridMultilevel"/>
     <w:tmpl w:val="BFBC3626"/>
@@ -1807,7 +2315,7 @@
       </w:rPr>
     </w:lvl>
   </w:abstractNum>
-  <w:abstractNum w:abstractNumId="6" w15:restartNumberingAfterBreak="0">
+  <w:abstractNum w:abstractNumId="9" w15:restartNumberingAfterBreak="0">
     <w:nsid w:val="729B6EA2"/>
     <w:multiLevelType w:val="hybridMultilevel"/>
     <w:tmpl w:val="1EE6D64A"/>
@@ -1920,7 +2428,7 @@
       </w:rPr>
     </w:lvl>
   </w:abstractNum>
-  <w:abstractNum w:abstractNumId="7" w15:restartNumberingAfterBreak="0">
+  <w:abstractNum w:abstractNumId="10" w15:restartNumberingAfterBreak="0">
     <w:nsid w:val="72C54B81"/>
     <w:multiLevelType w:val="hybridMultilevel"/>
     <w:tmpl w:val="A9B03FF6"/>
@@ -2033,7 +2541,7 @@
       </w:rPr>
     </w:lvl>
   </w:abstractNum>
-  <w:abstractNum w:abstractNumId="8" w15:restartNumberingAfterBreak="0">
+  <w:abstractNum w:abstractNumId="11" w15:restartNumberingAfterBreak="0">
     <w:nsid w:val="78DD7E30"/>
     <w:multiLevelType w:val="hybridMultilevel"/>
     <w:tmpl w:val="148EE08C"/>
@@ -2147,31 +2655,40 @@
     </w:lvl>
   </w:abstractNum>
   <w:num w:numId="1" w16cid:durableId="667363523">
-    <w:abstractNumId w:val="6"/>
+    <w:abstractNumId w:val="9"/>
   </w:num>
   <w:num w:numId="2" w16cid:durableId="1938324952">
     <w:abstractNumId w:val="2"/>
   </w:num>
   <w:num w:numId="3" w16cid:durableId="1044866364">
+    <w:abstractNumId w:val="11"/>
+  </w:num>
+  <w:num w:numId="4" w16cid:durableId="1944680418">
+    <w:abstractNumId w:val="10"/>
+  </w:num>
+  <w:num w:numId="5" w16cid:durableId="1015305127">
     <w:abstractNumId w:val="8"/>
   </w:num>
-  <w:num w:numId="4" w16cid:durableId="1944680418">
-    <w:abstractNumId w:val="7"/>
-  </w:num>
-  <w:num w:numId="5" w16cid:durableId="1015305127">
-    <w:abstractNumId w:val="5"/>
-  </w:num>
   <w:num w:numId="6" w16cid:durableId="1163349641">
-    <w:abstractNumId w:val="3"/>
+    <w:abstractNumId w:val="4"/>
   </w:num>
   <w:num w:numId="7" w16cid:durableId="1964456558">
-    <w:abstractNumId w:val="4"/>
+    <w:abstractNumId w:val="5"/>
   </w:num>
   <w:num w:numId="8" w16cid:durableId="1152865749">
     <w:abstractNumId w:val="1"/>
   </w:num>
   <w:num w:numId="9" w16cid:durableId="1961522577">
     <w:abstractNumId w:val="0"/>
+  </w:num>
+  <w:num w:numId="10" w16cid:durableId="592596091">
+    <w:abstractNumId w:val="7"/>
+  </w:num>
+  <w:num w:numId="11" w16cid:durableId="295066261">
+    <w:abstractNumId w:val="6"/>
+  </w:num>
+  <w:num w:numId="12" w16cid:durableId="1703284534">
+    <w:abstractNumId w:val="3"/>
   </w:num>
 </w:numbering>
 </file>

</xml_diff>

<commit_message>
update simulate page feedback
</commit_message>
<xml_diff>
--- a/Diary for project.docx
+++ b/Diary for project.docx
@@ -44,15 +44,7 @@
         </w:numPr>
       </w:pPr>
       <w:r>
-        <w:t xml:space="preserve">Made Lists of </w:t>
-      </w:r>
-      <w:proofErr w:type="gramStart"/>
-      <w:r>
-        <w:t>context</w:t>
-      </w:r>
-      <w:proofErr w:type="gramEnd"/>
-      <w:r>
-        <w:t xml:space="preserve"> and Started introduction </w:t>
+        <w:t xml:space="preserve">Made Lists of context and Started introduction </w:t>
       </w:r>
     </w:p>
     <w:p>
@@ -1008,6 +1000,134 @@
       </w:pPr>
       <w:r>
         <w:t>Kept working on report</w:t>
+      </w:r>
+    </w:p>
+    <w:p>
+      <w:pPr>
+        <w:rPr>
+          <w:b/>
+          <w:bCs/>
+        </w:rPr>
+      </w:pPr>
+      <w:r>
+        <w:rPr>
+          <w:b/>
+          <w:bCs/>
+        </w:rPr>
+        <w:t>22</w:t>
+      </w:r>
+      <w:r>
+        <w:rPr>
+          <w:b/>
+          <w:bCs/>
+        </w:rPr>
+        <w:t>/03/26</w:t>
+      </w:r>
+    </w:p>
+    <w:p>
+      <w:pPr>
+        <w:pStyle w:val="ListParagraph"/>
+        <w:numPr>
+          <w:ilvl w:val="0"/>
+          <w:numId w:val="13"/>
+        </w:numPr>
+        <w:rPr>
+          <w:b/>
+          <w:bCs/>
+        </w:rPr>
+      </w:pPr>
+      <w:r>
+        <w:t xml:space="preserve">Add password security and email auth </w:t>
+      </w:r>
+    </w:p>
+    <w:p>
+      <w:pPr>
+        <w:pStyle w:val="ListParagraph"/>
+        <w:numPr>
+          <w:ilvl w:val="0"/>
+          <w:numId w:val="13"/>
+        </w:numPr>
+        <w:rPr>
+          <w:b/>
+          <w:bCs/>
+        </w:rPr>
+      </w:pPr>
+      <w:r>
+        <w:t>More work on report</w:t>
+      </w:r>
+    </w:p>
+    <w:p>
+      <w:pPr>
+        <w:rPr>
+          <w:b/>
+          <w:bCs/>
+        </w:rPr>
+      </w:pPr>
+      <w:r>
+        <w:rPr>
+          <w:b/>
+          <w:bCs/>
+        </w:rPr>
+        <w:t>25/03/26</w:t>
+      </w:r>
+    </w:p>
+    <w:p>
+      <w:pPr>
+        <w:pStyle w:val="ListParagraph"/>
+        <w:numPr>
+          <w:ilvl w:val="0"/>
+          <w:numId w:val="14"/>
+        </w:numPr>
+        <w:rPr>
+          <w:b/>
+          <w:bCs/>
+        </w:rPr>
+      </w:pPr>
+      <w:r>
+        <w:t>Added timer</w:t>
+      </w:r>
+    </w:p>
+    <w:p>
+      <w:pPr>
+        <w:pStyle w:val="ListParagraph"/>
+        <w:numPr>
+          <w:ilvl w:val="0"/>
+          <w:numId w:val="14"/>
+        </w:numPr>
+        <w:rPr>
+          <w:b/>
+          <w:bCs/>
+        </w:rPr>
+      </w:pPr>
+      <w:r>
+        <w:t xml:space="preserve">Reordered layout by splitting into different </w:t>
+      </w:r>
+      <w:proofErr w:type="spellStart"/>
+      <w:r>
+        <w:t>py</w:t>
+      </w:r>
+      <w:proofErr w:type="spellEnd"/>
+      <w:r>
+        <w:t xml:space="preserve"> files e.g. auth, database</w:t>
+      </w:r>
+    </w:p>
+    <w:p>
+      <w:pPr>
+        <w:pStyle w:val="ListParagraph"/>
+        <w:numPr>
+          <w:ilvl w:val="0"/>
+          <w:numId w:val="14"/>
+        </w:numPr>
+        <w:rPr>
+          <w:b/>
+          <w:bCs/>
+        </w:rPr>
+      </w:pPr>
+      <w:r>
+        <w:t>Broke render</w:t>
+      </w:r>
+      <w:r>
+        <w:t xml:space="preserve">; trying to fix </w:t>
       </w:r>
     </w:p>
     <w:p/>
@@ -1299,6 +1419,119 @@
 <file path=word/numbering.xml><?xml version="1.0" encoding="utf-8"?>
 <w:numbering xmlns:wpc="http://schemas.microsoft.com/office/word/2010/wordprocessingCanvas" xmlns:cx="http://schemas.microsoft.com/office/drawing/2014/chartex" xmlns:cx1="http://schemas.microsoft.com/office/drawing/2015/9/8/chartex" xmlns:cx2="http://schemas.microsoft.com/office/drawing/2015/10/21/chartex" xmlns:cx3="http://schemas.microsoft.com/office/drawing/2016/5/9/chartex" xmlns:cx4="http://schemas.microsoft.com/office/drawing/2016/5/10/chartex" xmlns:cx5="http://schemas.microsoft.com/office/drawing/2016/5/11/chartex" xmlns:cx6="http://schemas.microsoft.com/office/drawing/2016/5/12/chartex" xmlns:cx7="http://schemas.microsoft.com/office/drawing/2016/5/13/chartex" xmlns:cx8="http://schemas.microsoft.com/office/drawing/2016/5/14/chartex" xmlns:mc="http://schemas.openxmlformats.org/markup-compatibility/2006" xmlns:aink="http://schemas.microsoft.com/office/drawing/2016/ink" xmlns:am3d="http://schemas.microsoft.com/office/drawing/2017/model3d" xmlns:o="urn:schemas-microsoft-com:office:office" xmlns:oel="http://schemas.microsoft.com/office/2019/extlst" xmlns:r="http://schemas.openxmlformats.org/officeDocument/2006/relationships" xmlns:m="http://schemas.openxmlformats.org/officeDocument/2006/math" xmlns:v="urn:schemas-microsoft-com:vml" xmlns:wp14="http://schemas.microsoft.com/office/word/2010/wordprocessingDrawing" xmlns:wp="http://schemas.openxmlformats.org/drawingml/2006/wordprocessingDrawing" xmlns:w10="urn:schemas-microsoft-com:office:word" xmlns:w="http://schemas.openxmlformats.org/wordprocessingml/2006/main" xmlns:w14="http://schemas.microsoft.com/office/word/2010/wordml" xmlns:w15="http://schemas.microsoft.com/office/word/2012/wordml" xmlns:w16cex="http://schemas.microsoft.com/office/word/2018/wordml/cex" xmlns:w16cid="http://schemas.microsoft.com/office/word/2016/wordml/cid" xmlns:w16="http://schemas.microsoft.com/office/word/2018/wordml" xmlns:w16du="http://schemas.microsoft.com/office/word/2023/wordml/word16du" xmlns:w16sdtdh="http://schemas.microsoft.com/office/word/2020/wordml/sdtdatahash" xmlns:w16sdtfl="http://schemas.microsoft.com/office/word/2024/wordml/sdtformatlock" xmlns:w16se="http://schemas.microsoft.com/office/word/2015/wordml/symex" xmlns:wpg="http://schemas.microsoft.com/office/word/2010/wordprocessingGroup" xmlns:wpi="http://schemas.microsoft.com/office/word/2010/wordprocessingInk" xmlns:wne="http://schemas.microsoft.com/office/word/2006/wordml" xmlns:wps="http://schemas.microsoft.com/office/word/2010/wordprocessingShape" mc:Ignorable="w14 w15 w16se w16cid w16 w16cex w16sdtdh w16sdtfl w16du wp14">
   <w:abstractNum w:abstractNumId="0" w15:restartNumberingAfterBreak="0">
+    <w:nsid w:val="05CE5F91"/>
+    <w:multiLevelType w:val="hybridMultilevel"/>
+    <w:tmpl w:val="08AE696C"/>
+    <w:lvl w:ilvl="0" w:tplc="18090001">
+      <w:start w:val="1"/>
+      <w:numFmt w:val="bullet"/>
+      <w:lvlText w:val=""/>
+      <w:lvlJc w:val="left"/>
+      <w:pPr>
+        <w:ind w:left="720" w:hanging="360"/>
+      </w:pPr>
+      <w:rPr>
+        <w:rFonts w:ascii="Symbol" w:hAnsi="Symbol" w:hint="default"/>
+      </w:rPr>
+    </w:lvl>
+    <w:lvl w:ilvl="1" w:tplc="18090003" w:tentative="1">
+      <w:start w:val="1"/>
+      <w:numFmt w:val="bullet"/>
+      <w:lvlText w:val="o"/>
+      <w:lvlJc w:val="left"/>
+      <w:pPr>
+        <w:ind w:left="1440" w:hanging="360"/>
+      </w:pPr>
+      <w:rPr>
+        <w:rFonts w:ascii="Courier New" w:hAnsi="Courier New" w:cs="Courier New" w:hint="default"/>
+      </w:rPr>
+    </w:lvl>
+    <w:lvl w:ilvl="2" w:tplc="18090005" w:tentative="1">
+      <w:start w:val="1"/>
+      <w:numFmt w:val="bullet"/>
+      <w:lvlText w:val=""/>
+      <w:lvlJc w:val="left"/>
+      <w:pPr>
+        <w:ind w:left="2160" w:hanging="360"/>
+      </w:pPr>
+      <w:rPr>
+        <w:rFonts w:ascii="Wingdings" w:hAnsi="Wingdings" w:hint="default"/>
+      </w:rPr>
+    </w:lvl>
+    <w:lvl w:ilvl="3" w:tplc="18090001" w:tentative="1">
+      <w:start w:val="1"/>
+      <w:numFmt w:val="bullet"/>
+      <w:lvlText w:val=""/>
+      <w:lvlJc w:val="left"/>
+      <w:pPr>
+        <w:ind w:left="2880" w:hanging="360"/>
+      </w:pPr>
+      <w:rPr>
+        <w:rFonts w:ascii="Symbol" w:hAnsi="Symbol" w:hint="default"/>
+      </w:rPr>
+    </w:lvl>
+    <w:lvl w:ilvl="4" w:tplc="18090003" w:tentative="1">
+      <w:start w:val="1"/>
+      <w:numFmt w:val="bullet"/>
+      <w:lvlText w:val="o"/>
+      <w:lvlJc w:val="left"/>
+      <w:pPr>
+        <w:ind w:left="3600" w:hanging="360"/>
+      </w:pPr>
+      <w:rPr>
+        <w:rFonts w:ascii="Courier New" w:hAnsi="Courier New" w:cs="Courier New" w:hint="default"/>
+      </w:rPr>
+    </w:lvl>
+    <w:lvl w:ilvl="5" w:tplc="18090005" w:tentative="1">
+      <w:start w:val="1"/>
+      <w:numFmt w:val="bullet"/>
+      <w:lvlText w:val=""/>
+      <w:lvlJc w:val="left"/>
+      <w:pPr>
+        <w:ind w:left="4320" w:hanging="360"/>
+      </w:pPr>
+      <w:rPr>
+        <w:rFonts w:ascii="Wingdings" w:hAnsi="Wingdings" w:hint="default"/>
+      </w:rPr>
+    </w:lvl>
+    <w:lvl w:ilvl="6" w:tplc="18090001" w:tentative="1">
+      <w:start w:val="1"/>
+      <w:numFmt w:val="bullet"/>
+      <w:lvlText w:val=""/>
+      <w:lvlJc w:val="left"/>
+      <w:pPr>
+        <w:ind w:left="5040" w:hanging="360"/>
+      </w:pPr>
+      <w:rPr>
+        <w:rFonts w:ascii="Symbol" w:hAnsi="Symbol" w:hint="default"/>
+      </w:rPr>
+    </w:lvl>
+    <w:lvl w:ilvl="7" w:tplc="18090003" w:tentative="1">
+      <w:start w:val="1"/>
+      <w:numFmt w:val="bullet"/>
+      <w:lvlText w:val="o"/>
+      <w:lvlJc w:val="left"/>
+      <w:pPr>
+        <w:ind w:left="5760" w:hanging="360"/>
+      </w:pPr>
+      <w:rPr>
+        <w:rFonts w:ascii="Courier New" w:hAnsi="Courier New" w:cs="Courier New" w:hint="default"/>
+      </w:rPr>
+    </w:lvl>
+    <w:lvl w:ilvl="8" w:tplc="18090005" w:tentative="1">
+      <w:start w:val="1"/>
+      <w:numFmt w:val="bullet"/>
+      <w:lvlText w:val=""/>
+      <w:lvlJc w:val="left"/>
+      <w:pPr>
+        <w:ind w:left="6480" w:hanging="360"/>
+      </w:pPr>
+      <w:rPr>
+        <w:rFonts w:ascii="Wingdings" w:hAnsi="Wingdings" w:hint="default"/>
+      </w:rPr>
+    </w:lvl>
+  </w:abstractNum>
+  <w:abstractNum w:abstractNumId="1" w15:restartNumberingAfterBreak="0">
     <w:nsid w:val="1254446B"/>
     <w:multiLevelType w:val="hybridMultilevel"/>
     <w:tmpl w:val="E7B6DA56"/>
@@ -1411,7 +1644,7 @@
       </w:rPr>
     </w:lvl>
   </w:abstractNum>
-  <w:abstractNum w:abstractNumId="1" w15:restartNumberingAfterBreak="0">
+  <w:abstractNum w:abstractNumId="2" w15:restartNumberingAfterBreak="0">
     <w:nsid w:val="1A463877"/>
     <w:multiLevelType w:val="hybridMultilevel"/>
     <w:tmpl w:val="BFA80A26"/>
@@ -1524,7 +1757,7 @@
       </w:rPr>
     </w:lvl>
   </w:abstractNum>
-  <w:abstractNum w:abstractNumId="2" w15:restartNumberingAfterBreak="0">
+  <w:abstractNum w:abstractNumId="3" w15:restartNumberingAfterBreak="0">
     <w:nsid w:val="1F953D3F"/>
     <w:multiLevelType w:val="hybridMultilevel"/>
     <w:tmpl w:val="20442008"/>
@@ -1637,7 +1870,7 @@
       </w:rPr>
     </w:lvl>
   </w:abstractNum>
-  <w:abstractNum w:abstractNumId="3" w15:restartNumberingAfterBreak="0">
+  <w:abstractNum w:abstractNumId="4" w15:restartNumberingAfterBreak="0">
     <w:nsid w:val="2BC1336D"/>
     <w:multiLevelType w:val="hybridMultilevel"/>
     <w:tmpl w:val="22581356"/>
@@ -1750,7 +1983,7 @@
       </w:rPr>
     </w:lvl>
   </w:abstractNum>
-  <w:abstractNum w:abstractNumId="4" w15:restartNumberingAfterBreak="0">
+  <w:abstractNum w:abstractNumId="5" w15:restartNumberingAfterBreak="0">
     <w:nsid w:val="2C8658B3"/>
     <w:multiLevelType w:val="hybridMultilevel"/>
     <w:tmpl w:val="C8B08D0A"/>
@@ -1863,7 +2096,7 @@
       </w:rPr>
     </w:lvl>
   </w:abstractNum>
-  <w:abstractNum w:abstractNumId="5" w15:restartNumberingAfterBreak="0">
+  <w:abstractNum w:abstractNumId="6" w15:restartNumberingAfterBreak="0">
     <w:nsid w:val="4A945192"/>
     <w:multiLevelType w:val="hybridMultilevel"/>
     <w:tmpl w:val="93581D76"/>
@@ -1976,7 +2209,7 @@
       </w:rPr>
     </w:lvl>
   </w:abstractNum>
-  <w:abstractNum w:abstractNumId="6" w15:restartNumberingAfterBreak="0">
+  <w:abstractNum w:abstractNumId="7" w15:restartNumberingAfterBreak="0">
     <w:nsid w:val="4C5474BD"/>
     <w:multiLevelType w:val="hybridMultilevel"/>
     <w:tmpl w:val="AA24B768"/>
@@ -2089,7 +2322,7 @@
       </w:rPr>
     </w:lvl>
   </w:abstractNum>
-  <w:abstractNum w:abstractNumId="7" w15:restartNumberingAfterBreak="0">
+  <w:abstractNum w:abstractNumId="8" w15:restartNumberingAfterBreak="0">
     <w:nsid w:val="4F6467E9"/>
     <w:multiLevelType w:val="hybridMultilevel"/>
     <w:tmpl w:val="5602DAE6"/>
@@ -2202,7 +2435,7 @@
       </w:rPr>
     </w:lvl>
   </w:abstractNum>
-  <w:abstractNum w:abstractNumId="8" w15:restartNumberingAfterBreak="0">
+  <w:abstractNum w:abstractNumId="9" w15:restartNumberingAfterBreak="0">
     <w:nsid w:val="64CA5392"/>
     <w:multiLevelType w:val="hybridMultilevel"/>
     <w:tmpl w:val="BFBC3626"/>
@@ -2315,7 +2548,7 @@
       </w:rPr>
     </w:lvl>
   </w:abstractNum>
-  <w:abstractNum w:abstractNumId="9" w15:restartNumberingAfterBreak="0">
+  <w:abstractNum w:abstractNumId="10" w15:restartNumberingAfterBreak="0">
     <w:nsid w:val="729B6EA2"/>
     <w:multiLevelType w:val="hybridMultilevel"/>
     <w:tmpl w:val="1EE6D64A"/>
@@ -2428,7 +2661,7 @@
       </w:rPr>
     </w:lvl>
   </w:abstractNum>
-  <w:abstractNum w:abstractNumId="10" w15:restartNumberingAfterBreak="0">
+  <w:abstractNum w:abstractNumId="11" w15:restartNumberingAfterBreak="0">
     <w:nsid w:val="72C54B81"/>
     <w:multiLevelType w:val="hybridMultilevel"/>
     <w:tmpl w:val="A9B03FF6"/>
@@ -2541,7 +2774,7 @@
       </w:rPr>
     </w:lvl>
   </w:abstractNum>
-  <w:abstractNum w:abstractNumId="11" w15:restartNumberingAfterBreak="0">
+  <w:abstractNum w:abstractNumId="12" w15:restartNumberingAfterBreak="0">
     <w:nsid w:val="78DD7E30"/>
     <w:multiLevelType w:val="hybridMultilevel"/>
     <w:tmpl w:val="148EE08C"/>
@@ -2654,41 +2887,160 @@
       </w:rPr>
     </w:lvl>
   </w:abstractNum>
+  <w:abstractNum w:abstractNumId="13" w15:restartNumberingAfterBreak="0">
+    <w:nsid w:val="7A641D23"/>
+    <w:multiLevelType w:val="hybridMultilevel"/>
+    <w:tmpl w:val="1B7E1FC2"/>
+    <w:lvl w:ilvl="0" w:tplc="18090001">
+      <w:start w:val="1"/>
+      <w:numFmt w:val="bullet"/>
+      <w:lvlText w:val=""/>
+      <w:lvlJc w:val="left"/>
+      <w:pPr>
+        <w:ind w:left="720" w:hanging="360"/>
+      </w:pPr>
+      <w:rPr>
+        <w:rFonts w:ascii="Symbol" w:hAnsi="Symbol" w:hint="default"/>
+      </w:rPr>
+    </w:lvl>
+    <w:lvl w:ilvl="1" w:tplc="18090003" w:tentative="1">
+      <w:start w:val="1"/>
+      <w:numFmt w:val="bullet"/>
+      <w:lvlText w:val="o"/>
+      <w:lvlJc w:val="left"/>
+      <w:pPr>
+        <w:ind w:left="1440" w:hanging="360"/>
+      </w:pPr>
+      <w:rPr>
+        <w:rFonts w:ascii="Courier New" w:hAnsi="Courier New" w:cs="Courier New" w:hint="default"/>
+      </w:rPr>
+    </w:lvl>
+    <w:lvl w:ilvl="2" w:tplc="18090005" w:tentative="1">
+      <w:start w:val="1"/>
+      <w:numFmt w:val="bullet"/>
+      <w:lvlText w:val=""/>
+      <w:lvlJc w:val="left"/>
+      <w:pPr>
+        <w:ind w:left="2160" w:hanging="360"/>
+      </w:pPr>
+      <w:rPr>
+        <w:rFonts w:ascii="Wingdings" w:hAnsi="Wingdings" w:hint="default"/>
+      </w:rPr>
+    </w:lvl>
+    <w:lvl w:ilvl="3" w:tplc="18090001" w:tentative="1">
+      <w:start w:val="1"/>
+      <w:numFmt w:val="bullet"/>
+      <w:lvlText w:val=""/>
+      <w:lvlJc w:val="left"/>
+      <w:pPr>
+        <w:ind w:left="2880" w:hanging="360"/>
+      </w:pPr>
+      <w:rPr>
+        <w:rFonts w:ascii="Symbol" w:hAnsi="Symbol" w:hint="default"/>
+      </w:rPr>
+    </w:lvl>
+    <w:lvl w:ilvl="4" w:tplc="18090003" w:tentative="1">
+      <w:start w:val="1"/>
+      <w:numFmt w:val="bullet"/>
+      <w:lvlText w:val="o"/>
+      <w:lvlJc w:val="left"/>
+      <w:pPr>
+        <w:ind w:left="3600" w:hanging="360"/>
+      </w:pPr>
+      <w:rPr>
+        <w:rFonts w:ascii="Courier New" w:hAnsi="Courier New" w:cs="Courier New" w:hint="default"/>
+      </w:rPr>
+    </w:lvl>
+    <w:lvl w:ilvl="5" w:tplc="18090005" w:tentative="1">
+      <w:start w:val="1"/>
+      <w:numFmt w:val="bullet"/>
+      <w:lvlText w:val=""/>
+      <w:lvlJc w:val="left"/>
+      <w:pPr>
+        <w:ind w:left="4320" w:hanging="360"/>
+      </w:pPr>
+      <w:rPr>
+        <w:rFonts w:ascii="Wingdings" w:hAnsi="Wingdings" w:hint="default"/>
+      </w:rPr>
+    </w:lvl>
+    <w:lvl w:ilvl="6" w:tplc="18090001" w:tentative="1">
+      <w:start w:val="1"/>
+      <w:numFmt w:val="bullet"/>
+      <w:lvlText w:val=""/>
+      <w:lvlJc w:val="left"/>
+      <w:pPr>
+        <w:ind w:left="5040" w:hanging="360"/>
+      </w:pPr>
+      <w:rPr>
+        <w:rFonts w:ascii="Symbol" w:hAnsi="Symbol" w:hint="default"/>
+      </w:rPr>
+    </w:lvl>
+    <w:lvl w:ilvl="7" w:tplc="18090003" w:tentative="1">
+      <w:start w:val="1"/>
+      <w:numFmt w:val="bullet"/>
+      <w:lvlText w:val="o"/>
+      <w:lvlJc w:val="left"/>
+      <w:pPr>
+        <w:ind w:left="5760" w:hanging="360"/>
+      </w:pPr>
+      <w:rPr>
+        <w:rFonts w:ascii="Courier New" w:hAnsi="Courier New" w:cs="Courier New" w:hint="default"/>
+      </w:rPr>
+    </w:lvl>
+    <w:lvl w:ilvl="8" w:tplc="18090005" w:tentative="1">
+      <w:start w:val="1"/>
+      <w:numFmt w:val="bullet"/>
+      <w:lvlText w:val=""/>
+      <w:lvlJc w:val="left"/>
+      <w:pPr>
+        <w:ind w:left="6480" w:hanging="360"/>
+      </w:pPr>
+      <w:rPr>
+        <w:rFonts w:ascii="Wingdings" w:hAnsi="Wingdings" w:hint="default"/>
+      </w:rPr>
+    </w:lvl>
+  </w:abstractNum>
   <w:num w:numId="1" w16cid:durableId="667363523">
+    <w:abstractNumId w:val="10"/>
+  </w:num>
+  <w:num w:numId="2" w16cid:durableId="1938324952">
+    <w:abstractNumId w:val="3"/>
+  </w:num>
+  <w:num w:numId="3" w16cid:durableId="1044866364">
+    <w:abstractNumId w:val="12"/>
+  </w:num>
+  <w:num w:numId="4" w16cid:durableId="1944680418">
+    <w:abstractNumId w:val="11"/>
+  </w:num>
+  <w:num w:numId="5" w16cid:durableId="1015305127">
     <w:abstractNumId w:val="9"/>
   </w:num>
-  <w:num w:numId="2" w16cid:durableId="1938324952">
+  <w:num w:numId="6" w16cid:durableId="1163349641">
+    <w:abstractNumId w:val="5"/>
+  </w:num>
+  <w:num w:numId="7" w16cid:durableId="1964456558">
+    <w:abstractNumId w:val="6"/>
+  </w:num>
+  <w:num w:numId="8" w16cid:durableId="1152865749">
     <w:abstractNumId w:val="2"/>
   </w:num>
-  <w:num w:numId="3" w16cid:durableId="1044866364">
-    <w:abstractNumId w:val="11"/>
+  <w:num w:numId="9" w16cid:durableId="1961522577">
+    <w:abstractNumId w:val="1"/>
   </w:num>
-  <w:num w:numId="4" w16cid:durableId="1944680418">
-    <w:abstractNumId w:val="10"/>
-  </w:num>
-  <w:num w:numId="5" w16cid:durableId="1015305127">
+  <w:num w:numId="10" w16cid:durableId="592596091">
     <w:abstractNumId w:val="8"/>
   </w:num>
-  <w:num w:numId="6" w16cid:durableId="1163349641">
+  <w:num w:numId="11" w16cid:durableId="295066261">
+    <w:abstractNumId w:val="7"/>
+  </w:num>
+  <w:num w:numId="12" w16cid:durableId="1703284534">
     <w:abstractNumId w:val="4"/>
   </w:num>
-  <w:num w:numId="7" w16cid:durableId="1964456558">
-    <w:abstractNumId w:val="5"/>
-  </w:num>
-  <w:num w:numId="8" w16cid:durableId="1152865749">
-    <w:abstractNumId w:val="1"/>
-  </w:num>
-  <w:num w:numId="9" w16cid:durableId="1961522577">
+  <w:num w:numId="13" w16cid:durableId="1479879125">
     <w:abstractNumId w:val="0"/>
   </w:num>
-  <w:num w:numId="10" w16cid:durableId="592596091">
-    <w:abstractNumId w:val="7"/>
-  </w:num>
-  <w:num w:numId="11" w16cid:durableId="295066261">
-    <w:abstractNumId w:val="6"/>
-  </w:num>
-  <w:num w:numId="12" w16cid:durableId="1703284534">
-    <w:abstractNumId w:val="3"/>
+  <w:num w:numId="14" w16cid:durableId="2142993973">
+    <w:abstractNumId w:val="13"/>
   </w:num>
 </w:numbering>
 </file>

</xml_diff>